<commit_message>
fix home state citation typo; fix help text display error
</commit_message>
<xml_diff>
--- a/docassemble/MLHDivorceAndCustody/data/templates/UCCJEA_affidavit_mc416_addendum.docx
+++ b/docassemble/MLHDivorceAndCustody/data/templates/UCCJEA_affidavit_mc416_addendum.docx
@@ -955,13 +955,19 @@
         <w:rPr>
           <w:rFonts w:ascii="Arial" w:hAnsi="Arial" w:cs="Arial"/>
         </w:rPr>
-        <w:t>within the last 6 months. MCL 722.1201(1)(b</w:t>
-      </w:r>
-      <w:r>
-        <w:rPr>
-          <w:rFonts w:ascii="Arial" w:hAnsi="Arial" w:cs="Arial"/>
-        </w:rPr>
-        <w:t>).{%</w:t>
+        <w:t xml:space="preserve">within the last 6 months. </w:t>
+      </w:r>
+      <w:r>
+        <w:rPr>
+          <w:rFonts w:ascii="Arial" w:hAnsi="Arial" w:cs="Arial"/>
+        </w:rPr>
+        <w:t>MCL 722.1201(1)(a)</w:t>
+      </w:r>
+      <w:r>
+        <w:rPr>
+          <w:rFonts w:ascii="Arial" w:hAnsi="Arial" w:cs="Arial"/>
+        </w:rPr>
+        <w:t>.{%</w:t>
       </w:r>
       <w:r>
         <w:rPr>

</xml_diff>

<commit_message>
add post launch enhancements
</commit_message>
<xml_diff>
--- a/docassemble/MLHDivorceAndCustody/data/templates/UCCJEA_affidavit_mc416_addendum.docx
+++ b/docassemble/MLHDivorceAndCustody/data/templates/UCCJEA_affidavit_mc416_addendum.docx
@@ -37,12 +37,14 @@
         </w:rPr>
         <w:t xml:space="preserve"> </w:t>
       </w:r>
+      <w:proofErr w:type="spellStart"/>
       <w:r>
         <w:rPr>
           <w:rFonts w:ascii="Arial" w:hAnsi="Arial" w:cs="Arial"/>
         </w:rPr>
         <w:t>children_previous_address</w:t>
       </w:r>
+      <w:proofErr w:type="spellEnd"/>
       <w:r>
         <w:rPr>
           <w:rFonts w:ascii="Arial" w:hAnsi="Arial" w:cs="Arial"/>
@@ -127,6 +129,7 @@
         </w:rPr>
         <w:t xml:space="preserve"> address in </w:t>
       </w:r>
+      <w:proofErr w:type="spellStart"/>
       <w:r>
         <w:rPr>
           <w:rFonts w:ascii="Arial" w:hAnsi="Arial" w:cs="Arial"/>
@@ -139,6 +142,7 @@
         </w:rPr>
         <w:t>address</w:t>
       </w:r>
+      <w:proofErr w:type="spellEnd"/>
       <w:r>
         <w:rPr>
           <w:rFonts w:ascii="Arial" w:hAnsi="Arial" w:cs="Arial"/>
@@ -166,29 +170,143 @@
           <w:rFonts w:ascii="Arial" w:hAnsi="Arial" w:cs="Arial"/>
         </w:rPr>
       </w:pPr>
+      <w:proofErr w:type="gramStart"/>
       <w:r>
         <w:rPr>
           <w:rFonts w:ascii="Arial" w:hAnsi="Arial" w:cs="Arial"/>
         </w:rPr>
         <w:t xml:space="preserve">{{ </w:t>
       </w:r>
-      <w:r>
-        <w:rPr>
-          <w:rFonts w:ascii="Arial" w:hAnsi="Arial" w:cs="Arial"/>
-        </w:rPr>
-        <w:t xml:space="preserve">address.on_one_line() </w:t>
-      </w:r>
-      <w:r>
-        <w:rPr>
-          <w:rFonts w:ascii="Arial" w:hAnsi="Arial" w:cs="Arial"/>
-        </w:rPr>
-        <w:t>}}</w:t>
-      </w:r>
-      <w:r>
-        <w:rPr>
-          <w:rFonts w:ascii="Arial" w:hAnsi="Arial" w:cs="Arial"/>
-        </w:rPr>
-        <w:t xml:space="preserve"> – from {{ address.start_date }} to {{ address.end_date }}</w:t>
+      <w:proofErr w:type="spellStart"/>
+      <w:r>
+        <w:rPr>
+          <w:rFonts w:ascii="Arial" w:hAnsi="Arial" w:cs="Arial"/>
+        </w:rPr>
+        <w:t>address</w:t>
+      </w:r>
+      <w:proofErr w:type="gramEnd"/>
+      <w:r>
+        <w:rPr>
+          <w:rFonts w:ascii="Arial" w:hAnsi="Arial" w:cs="Arial"/>
+        </w:rPr>
+        <w:t>.on_one_</w:t>
+      </w:r>
+      <w:proofErr w:type="gramStart"/>
+      <w:r>
+        <w:rPr>
+          <w:rFonts w:ascii="Arial" w:hAnsi="Arial" w:cs="Arial"/>
+        </w:rPr>
+        <w:t>line</w:t>
+      </w:r>
+      <w:proofErr w:type="spellEnd"/>
+      <w:r>
+        <w:rPr>
+          <w:rFonts w:ascii="Arial" w:hAnsi="Arial" w:cs="Arial"/>
+        </w:rPr>
+        <w:t xml:space="preserve">() </w:t>
+      </w:r>
+      <w:r>
+        <w:rPr>
+          <w:rFonts w:ascii="Arial" w:hAnsi="Arial" w:cs="Arial"/>
+        </w:rPr>
+        <w:t>}</w:t>
+      </w:r>
+      <w:proofErr w:type="gramEnd"/>
+      <w:r>
+        <w:rPr>
+          <w:rFonts w:ascii="Arial" w:hAnsi="Arial" w:cs="Arial"/>
+        </w:rPr>
+        <w:t>}</w:t>
+      </w:r>
+      <w:r>
+        <w:rPr>
+          <w:rFonts w:ascii="Arial" w:hAnsi="Arial" w:cs="Arial"/>
+        </w:rPr>
+        <w:t xml:space="preserve"> – from </w:t>
+      </w:r>
+      <w:proofErr w:type="gramStart"/>
+      <w:r>
+        <w:rPr>
+          <w:rFonts w:ascii="Arial" w:hAnsi="Arial" w:cs="Arial"/>
+        </w:rPr>
+        <w:t xml:space="preserve">{{ </w:t>
+      </w:r>
+      <w:proofErr w:type="spellStart"/>
+      <w:r>
+        <w:rPr>
+          <w:rFonts w:ascii="Arial" w:hAnsi="Arial" w:cs="Arial"/>
+        </w:rPr>
+        <w:t>address</w:t>
+      </w:r>
+      <w:proofErr w:type="gramEnd"/>
+      <w:r>
+        <w:rPr>
+          <w:rFonts w:ascii="Arial" w:hAnsi="Arial" w:cs="Arial"/>
+        </w:rPr>
+        <w:t>.start_</w:t>
+      </w:r>
+      <w:proofErr w:type="gramStart"/>
+      <w:r>
+        <w:rPr>
+          <w:rFonts w:ascii="Arial" w:hAnsi="Arial" w:cs="Arial"/>
+        </w:rPr>
+        <w:t>date</w:t>
+      </w:r>
+      <w:proofErr w:type="spellEnd"/>
+      <w:r>
+        <w:rPr>
+          <w:rFonts w:ascii="Arial" w:hAnsi="Arial" w:cs="Arial"/>
+        </w:rPr>
+        <w:t xml:space="preserve"> }</w:t>
+      </w:r>
+      <w:proofErr w:type="gramEnd"/>
+      <w:r>
+        <w:rPr>
+          <w:rFonts w:ascii="Arial" w:hAnsi="Arial" w:cs="Arial"/>
+        </w:rPr>
+        <w:t xml:space="preserve">} to </w:t>
+      </w:r>
+      <w:proofErr w:type="gramStart"/>
+      <w:r>
+        <w:rPr>
+          <w:rFonts w:ascii="Arial" w:hAnsi="Arial" w:cs="Arial"/>
+        </w:rPr>
+        <w:t xml:space="preserve">{{ </w:t>
+      </w:r>
+      <w:proofErr w:type="spellStart"/>
+      <w:r>
+        <w:rPr>
+          <w:rFonts w:ascii="Arial" w:hAnsi="Arial" w:cs="Arial"/>
+        </w:rPr>
+        <w:t>address.end</w:t>
+      </w:r>
+      <w:proofErr w:type="gramEnd"/>
+      <w:r>
+        <w:rPr>
+          <w:rFonts w:ascii="Arial" w:hAnsi="Arial" w:cs="Arial"/>
+        </w:rPr>
+        <w:t>_</w:t>
+      </w:r>
+      <w:proofErr w:type="gramStart"/>
+      <w:r>
+        <w:rPr>
+          <w:rFonts w:ascii="Arial" w:hAnsi="Arial" w:cs="Arial"/>
+        </w:rPr>
+        <w:t>date</w:t>
+      </w:r>
+      <w:proofErr w:type="spellEnd"/>
+      <w:r>
+        <w:rPr>
+          <w:rFonts w:ascii="Arial" w:hAnsi="Arial" w:cs="Arial"/>
+        </w:rPr>
+        <w:t xml:space="preserve"> }</w:t>
+      </w:r>
+      <w:proofErr w:type="gramEnd"/>
+      <w:r>
+        <w:rPr>
+          <w:rFonts w:ascii="Arial" w:hAnsi="Arial" w:cs="Arial"/>
+        </w:rPr>
+        <w:t>}</w:t>
       </w:r>
     </w:p>
     <w:p>
@@ -203,7 +321,23 @@
           <w:rFonts w:ascii="Arial" w:hAnsi="Arial" w:cs="Arial"/>
           <w:highlight w:val="magenta"/>
         </w:rPr>
-        <w:t>{%p endfor %}</w:t>
+        <w:t xml:space="preserve">{%p </w:t>
+      </w:r>
+      <w:proofErr w:type="spellStart"/>
+      <w:r>
+        <w:rPr>
+          <w:rFonts w:ascii="Arial" w:hAnsi="Arial" w:cs="Arial"/>
+          <w:highlight w:val="magenta"/>
+        </w:rPr>
+        <w:t>endfor</w:t>
+      </w:r>
+      <w:proofErr w:type="spellEnd"/>
+      <w:r>
+        <w:rPr>
+          <w:rFonts w:ascii="Arial" w:hAnsi="Arial" w:cs="Arial"/>
+          <w:highlight w:val="magenta"/>
+        </w:rPr>
+        <w:t xml:space="preserve"> %}</w:t>
       </w:r>
     </w:p>
     <w:p>
@@ -248,7 +382,29 @@
         <w:rPr>
           <w:rFonts w:ascii="Arial" w:hAnsi="Arial" w:cs="Arial"/>
         </w:rPr>
-        <w:t xml:space="preserve"> prior_family_cases.filter(add_to_MC416_4=True) | length &gt; </w:t>
+        <w:t xml:space="preserve"> </w:t>
+      </w:r>
+      <w:proofErr w:type="spellStart"/>
+      <w:r>
+        <w:rPr>
+          <w:rFonts w:ascii="Arial" w:hAnsi="Arial" w:cs="Arial"/>
+        </w:rPr>
+        <w:t>prior_family_</w:t>
+      </w:r>
+      <w:proofErr w:type="gramStart"/>
+      <w:r>
+        <w:rPr>
+          <w:rFonts w:ascii="Arial" w:hAnsi="Arial" w:cs="Arial"/>
+        </w:rPr>
+        <w:t>cases.filter</w:t>
+      </w:r>
+      <w:proofErr w:type="spellEnd"/>
+      <w:proofErr w:type="gramEnd"/>
+      <w:r>
+        <w:rPr>
+          <w:rFonts w:ascii="Arial" w:hAnsi="Arial" w:cs="Arial"/>
+        </w:rPr>
+        <w:t xml:space="preserve">(add_to_MC416_4=True) | length &gt; </w:t>
       </w:r>
       <w:r>
         <w:rPr>
@@ -311,8 +467,16 @@
         <w:rPr>
           <w:rFonts w:ascii="Arial" w:hAnsi="Arial" w:cs="Arial"/>
         </w:rPr>
-        <w:t>case in prior_family_cases</w:t>
-      </w:r>
+        <w:t xml:space="preserve">case in </w:t>
+      </w:r>
+      <w:proofErr w:type="spellStart"/>
+      <w:r>
+        <w:rPr>
+          <w:rFonts w:ascii="Arial" w:hAnsi="Arial" w:cs="Arial"/>
+        </w:rPr>
+        <w:t>prior_family_cases</w:t>
+      </w:r>
+      <w:proofErr w:type="spellEnd"/>
       <w:r>
         <w:rPr>
           <w:rFonts w:ascii="Arial" w:hAnsi="Arial" w:cs="Arial"/>
@@ -365,19 +529,509 @@
         <w:rPr>
           <w:rFonts w:ascii="Arial" w:hAnsi="Arial" w:cs="Arial"/>
         </w:rPr>
-        <w:t xml:space="preserve">{{ case.title }}; Case #: {{ case.docket_number }}; {{ case.court if case.state != "MI" else court_list.get_court_info_by_2([case.county], ['circuit'], column_1='address_county', column_2='type', return_column='name') }}; {{ case.address if case.state != "MI" else court_list.get_court_info_by_2([case.county], ['circuit'], column_1='address_county', column_2='type', return_column='address_address') ~ " " ~ court_list.get_court_info_by_2([case.county], ['circuit'], column_1='address_county', column_2='type', return_column='address_unit') ~ ", " ~ court_list.get_court_info_by_2([case.county], ['circuit'], column_1='address_county', column_2='type', return_column='CSZ') }}; </w:t>
-      </w:r>
-      <w:r>
-        <w:rPr>
-          <w:rFonts w:ascii="Arial" w:hAnsi="Arial" w:cs="Arial"/>
-        </w:rPr>
-        <w:t xml:space="preserve">Nature: {{ prior_family_case_types_ordered[case.type] }}; </w:t>
-      </w:r>
-      <w:r>
-        <w:rPr>
-          <w:rFonts w:ascii="Arial" w:hAnsi="Arial" w:cs="Arial"/>
-        </w:rPr>
-        <w:t>Order date: {{ format_date(case.final_order_date, format='M/d/yyyy') if case.type not in ["divorce", "separate_maintenance"] and case.status == "ended_with_order" else format_date(case.custody_PT_order_date, format='M/d/yyyy') }}{{ "; This proceeding is continuing." if case.status == "pending" else "; This proceeding has been stayed by the court." if case.status == "stayed" else "; This proceeding was later dismissed." if case.status == "dismissed" else "" }}</w:t>
+        <w:t xml:space="preserve">{{ </w:t>
+      </w:r>
+      <w:proofErr w:type="spellStart"/>
+      <w:r>
+        <w:rPr>
+          <w:rFonts w:ascii="Arial" w:hAnsi="Arial" w:cs="Arial"/>
+        </w:rPr>
+        <w:t>case.title</w:t>
+      </w:r>
+      <w:proofErr w:type="spellEnd"/>
+      <w:r>
+        <w:rPr>
+          <w:rFonts w:ascii="Arial" w:hAnsi="Arial" w:cs="Arial"/>
+        </w:rPr>
+        <w:t xml:space="preserve"> }}; Case #: {{ </w:t>
+      </w:r>
+      <w:proofErr w:type="spellStart"/>
+      <w:r>
+        <w:rPr>
+          <w:rFonts w:ascii="Arial" w:hAnsi="Arial" w:cs="Arial"/>
+        </w:rPr>
+        <w:t>case.docket_number</w:t>
+      </w:r>
+      <w:proofErr w:type="spellEnd"/>
+      <w:r>
+        <w:rPr>
+          <w:rFonts w:ascii="Arial" w:hAnsi="Arial" w:cs="Arial"/>
+        </w:rPr>
+        <w:t xml:space="preserve"> }}; {{ </w:t>
+      </w:r>
+      <w:proofErr w:type="spellStart"/>
+      <w:r>
+        <w:rPr>
+          <w:rFonts w:ascii="Arial" w:hAnsi="Arial" w:cs="Arial"/>
+        </w:rPr>
+        <w:t>case.court</w:t>
+      </w:r>
+      <w:proofErr w:type="spellEnd"/>
+      <w:r>
+        <w:rPr>
+          <w:rFonts w:ascii="Arial" w:hAnsi="Arial" w:cs="Arial"/>
+        </w:rPr>
+        <w:t xml:space="preserve"> if </w:t>
+      </w:r>
+      <w:proofErr w:type="spellStart"/>
+      <w:r>
+        <w:rPr>
+          <w:rFonts w:ascii="Arial" w:hAnsi="Arial" w:cs="Arial"/>
+        </w:rPr>
+        <w:t>case.state</w:t>
+      </w:r>
+      <w:proofErr w:type="spellEnd"/>
+      <w:r>
+        <w:rPr>
+          <w:rFonts w:ascii="Arial" w:hAnsi="Arial" w:cs="Arial"/>
+        </w:rPr>
+        <w:t xml:space="preserve"> != "MI" else court_list.get_court_info_by_2([</w:t>
+      </w:r>
+      <w:proofErr w:type="spellStart"/>
+      <w:r>
+        <w:rPr>
+          <w:rFonts w:ascii="Arial" w:hAnsi="Arial" w:cs="Arial"/>
+        </w:rPr>
+        <w:t>case.county</w:t>
+      </w:r>
+      <w:proofErr w:type="spellEnd"/>
+      <w:r>
+        <w:rPr>
+          <w:rFonts w:ascii="Arial" w:hAnsi="Arial" w:cs="Arial"/>
+        </w:rPr>
+        <w:t>], ['circuit'], column_1='</w:t>
+      </w:r>
+      <w:proofErr w:type="spellStart"/>
+      <w:r>
+        <w:rPr>
+          <w:rFonts w:ascii="Arial" w:hAnsi="Arial" w:cs="Arial"/>
+        </w:rPr>
+        <w:t>address_county</w:t>
+      </w:r>
+      <w:proofErr w:type="spellEnd"/>
+      <w:r>
+        <w:rPr>
+          <w:rFonts w:ascii="Arial" w:hAnsi="Arial" w:cs="Arial"/>
+        </w:rPr>
+        <w:t xml:space="preserve">', column_2='type', </w:t>
+      </w:r>
+      <w:proofErr w:type="spellStart"/>
+      <w:r>
+        <w:rPr>
+          <w:rFonts w:ascii="Arial" w:hAnsi="Arial" w:cs="Arial"/>
+        </w:rPr>
+        <w:t>return_column</w:t>
+      </w:r>
+      <w:proofErr w:type="spellEnd"/>
+      <w:r>
+        <w:rPr>
+          <w:rFonts w:ascii="Arial" w:hAnsi="Arial" w:cs="Arial"/>
+        </w:rPr>
+        <w:t xml:space="preserve">='name') }}; {{ </w:t>
+      </w:r>
+      <w:proofErr w:type="spellStart"/>
+      <w:r>
+        <w:rPr>
+          <w:rFonts w:ascii="Arial" w:hAnsi="Arial" w:cs="Arial"/>
+        </w:rPr>
+        <w:t>case.address</w:t>
+      </w:r>
+      <w:proofErr w:type="spellEnd"/>
+      <w:r>
+        <w:rPr>
+          <w:rFonts w:ascii="Arial" w:hAnsi="Arial" w:cs="Arial"/>
+        </w:rPr>
+        <w:t xml:space="preserve"> if </w:t>
+      </w:r>
+      <w:proofErr w:type="spellStart"/>
+      <w:r>
+        <w:rPr>
+          <w:rFonts w:ascii="Arial" w:hAnsi="Arial" w:cs="Arial"/>
+        </w:rPr>
+        <w:t>case.state</w:t>
+      </w:r>
+      <w:proofErr w:type="spellEnd"/>
+      <w:r>
+        <w:rPr>
+          <w:rFonts w:ascii="Arial" w:hAnsi="Arial" w:cs="Arial"/>
+        </w:rPr>
+        <w:t xml:space="preserve"> != "MI" else court_list.get_court_info_by_2([</w:t>
+      </w:r>
+      <w:proofErr w:type="spellStart"/>
+      <w:r>
+        <w:rPr>
+          <w:rFonts w:ascii="Arial" w:hAnsi="Arial" w:cs="Arial"/>
+        </w:rPr>
+        <w:t>case.county</w:t>
+      </w:r>
+      <w:proofErr w:type="spellEnd"/>
+      <w:r>
+        <w:rPr>
+          <w:rFonts w:ascii="Arial" w:hAnsi="Arial" w:cs="Arial"/>
+        </w:rPr>
+        <w:t>], ['circuit'], column_1='</w:t>
+      </w:r>
+      <w:proofErr w:type="spellStart"/>
+      <w:r>
+        <w:rPr>
+          <w:rFonts w:ascii="Arial" w:hAnsi="Arial" w:cs="Arial"/>
+        </w:rPr>
+        <w:t>address_county</w:t>
+      </w:r>
+      <w:proofErr w:type="spellEnd"/>
+      <w:r>
+        <w:rPr>
+          <w:rFonts w:ascii="Arial" w:hAnsi="Arial" w:cs="Arial"/>
+        </w:rPr>
+        <w:t xml:space="preserve">', column_2='type', </w:t>
+      </w:r>
+      <w:proofErr w:type="spellStart"/>
+      <w:r>
+        <w:rPr>
+          <w:rFonts w:ascii="Arial" w:hAnsi="Arial" w:cs="Arial"/>
+        </w:rPr>
+        <w:t>return_column</w:t>
+      </w:r>
+      <w:proofErr w:type="spellEnd"/>
+      <w:r>
+        <w:rPr>
+          <w:rFonts w:ascii="Arial" w:hAnsi="Arial" w:cs="Arial"/>
+        </w:rPr>
+        <w:t>='</w:t>
+      </w:r>
+      <w:proofErr w:type="spellStart"/>
+      <w:r>
+        <w:rPr>
+          <w:rFonts w:ascii="Arial" w:hAnsi="Arial" w:cs="Arial"/>
+        </w:rPr>
+        <w:t>address_address</w:t>
+      </w:r>
+      <w:proofErr w:type="spellEnd"/>
+      <w:r>
+        <w:rPr>
+          <w:rFonts w:ascii="Arial" w:hAnsi="Arial" w:cs="Arial"/>
+        </w:rPr>
+        <w:t>') ~ " " ~ court_list.get_court_info_by_2([</w:t>
+      </w:r>
+      <w:proofErr w:type="spellStart"/>
+      <w:r>
+        <w:rPr>
+          <w:rFonts w:ascii="Arial" w:hAnsi="Arial" w:cs="Arial"/>
+        </w:rPr>
+        <w:t>case.county</w:t>
+      </w:r>
+      <w:proofErr w:type="spellEnd"/>
+      <w:r>
+        <w:rPr>
+          <w:rFonts w:ascii="Arial" w:hAnsi="Arial" w:cs="Arial"/>
+        </w:rPr>
+        <w:t>], ['circuit'], column_1='</w:t>
+      </w:r>
+      <w:proofErr w:type="spellStart"/>
+      <w:r>
+        <w:rPr>
+          <w:rFonts w:ascii="Arial" w:hAnsi="Arial" w:cs="Arial"/>
+        </w:rPr>
+        <w:t>address_county</w:t>
+      </w:r>
+      <w:proofErr w:type="spellEnd"/>
+      <w:r>
+        <w:rPr>
+          <w:rFonts w:ascii="Arial" w:hAnsi="Arial" w:cs="Arial"/>
+        </w:rPr>
+        <w:t xml:space="preserve">', column_2='type', </w:t>
+      </w:r>
+      <w:proofErr w:type="spellStart"/>
+      <w:r>
+        <w:rPr>
+          <w:rFonts w:ascii="Arial" w:hAnsi="Arial" w:cs="Arial"/>
+        </w:rPr>
+        <w:t>return_column</w:t>
+      </w:r>
+      <w:proofErr w:type="spellEnd"/>
+      <w:r>
+        <w:rPr>
+          <w:rFonts w:ascii="Arial" w:hAnsi="Arial" w:cs="Arial"/>
+        </w:rPr>
+        <w:t>='</w:t>
+      </w:r>
+      <w:proofErr w:type="spellStart"/>
+      <w:r>
+        <w:rPr>
+          <w:rFonts w:ascii="Arial" w:hAnsi="Arial" w:cs="Arial"/>
+        </w:rPr>
+        <w:t>address_unit</w:t>
+      </w:r>
+      <w:proofErr w:type="spellEnd"/>
+      <w:r>
+        <w:rPr>
+          <w:rFonts w:ascii="Arial" w:hAnsi="Arial" w:cs="Arial"/>
+        </w:rPr>
+        <w:t>') ~ ", " ~ court_list.get_court_info_by_2([</w:t>
+      </w:r>
+      <w:proofErr w:type="spellStart"/>
+      <w:r>
+        <w:rPr>
+          <w:rFonts w:ascii="Arial" w:hAnsi="Arial" w:cs="Arial"/>
+        </w:rPr>
+        <w:t>case.county</w:t>
+      </w:r>
+      <w:proofErr w:type="spellEnd"/>
+      <w:r>
+        <w:rPr>
+          <w:rFonts w:ascii="Arial" w:hAnsi="Arial" w:cs="Arial"/>
+        </w:rPr>
+        <w:t>], ['circuit'], column_1='</w:t>
+      </w:r>
+      <w:proofErr w:type="spellStart"/>
+      <w:r>
+        <w:rPr>
+          <w:rFonts w:ascii="Arial" w:hAnsi="Arial" w:cs="Arial"/>
+        </w:rPr>
+        <w:t>address_county</w:t>
+      </w:r>
+      <w:proofErr w:type="spellEnd"/>
+      <w:r>
+        <w:rPr>
+          <w:rFonts w:ascii="Arial" w:hAnsi="Arial" w:cs="Arial"/>
+        </w:rPr>
+        <w:t xml:space="preserve">', column_2='type', </w:t>
+      </w:r>
+      <w:proofErr w:type="spellStart"/>
+      <w:r>
+        <w:rPr>
+          <w:rFonts w:ascii="Arial" w:hAnsi="Arial" w:cs="Arial"/>
+        </w:rPr>
+        <w:t>return_column</w:t>
+      </w:r>
+      <w:proofErr w:type="spellEnd"/>
+      <w:r>
+        <w:rPr>
+          <w:rFonts w:ascii="Arial" w:hAnsi="Arial" w:cs="Arial"/>
+        </w:rPr>
+        <w:t xml:space="preserve">='CSZ') }}; </w:t>
+      </w:r>
+      <w:r>
+        <w:rPr>
+          <w:rFonts w:ascii="Arial" w:hAnsi="Arial" w:cs="Arial"/>
+        </w:rPr>
+        <w:t xml:space="preserve">Nature: {{ </w:t>
+      </w:r>
+      <w:proofErr w:type="spellStart"/>
+      <w:r>
+        <w:rPr>
+          <w:rFonts w:ascii="Arial" w:hAnsi="Arial" w:cs="Arial"/>
+        </w:rPr>
+        <w:t>prior_family_case_types_ordered</w:t>
+      </w:r>
+      <w:proofErr w:type="spellEnd"/>
+      <w:r>
+        <w:rPr>
+          <w:rFonts w:ascii="Arial" w:hAnsi="Arial" w:cs="Arial"/>
+        </w:rPr>
+        <w:t>[</w:t>
+      </w:r>
+      <w:proofErr w:type="spellStart"/>
+      <w:r>
+        <w:rPr>
+          <w:rFonts w:ascii="Arial" w:hAnsi="Arial" w:cs="Arial"/>
+        </w:rPr>
+        <w:t>case.type</w:t>
+      </w:r>
+      <w:proofErr w:type="spellEnd"/>
+      <w:r>
+        <w:rPr>
+          <w:rFonts w:ascii="Arial" w:hAnsi="Arial" w:cs="Arial"/>
+        </w:rPr>
+        <w:t xml:space="preserve">] }}; </w:t>
+      </w:r>
+      <w:r>
+        <w:rPr>
+          <w:rFonts w:ascii="Arial" w:hAnsi="Arial" w:cs="Arial"/>
+        </w:rPr>
+        <w:t xml:space="preserve">Order date: {{ </w:t>
+      </w:r>
+      <w:proofErr w:type="spellStart"/>
+      <w:r>
+        <w:rPr>
+          <w:rFonts w:ascii="Arial" w:hAnsi="Arial" w:cs="Arial"/>
+        </w:rPr>
+        <w:t>format_date</w:t>
+      </w:r>
+      <w:proofErr w:type="spellEnd"/>
+      <w:r>
+        <w:rPr>
+          <w:rFonts w:ascii="Arial" w:hAnsi="Arial" w:cs="Arial"/>
+        </w:rPr>
+        <w:t>(</w:t>
+      </w:r>
+      <w:proofErr w:type="spellStart"/>
+      <w:r>
+        <w:rPr>
+          <w:rFonts w:ascii="Arial" w:hAnsi="Arial" w:cs="Arial"/>
+        </w:rPr>
+        <w:t>case.final_order_date</w:t>
+      </w:r>
+      <w:proofErr w:type="spellEnd"/>
+      <w:r>
+        <w:rPr>
+          <w:rFonts w:ascii="Arial" w:hAnsi="Arial" w:cs="Arial"/>
+        </w:rPr>
+        <w:t>, format='M/d/</w:t>
+      </w:r>
+      <w:proofErr w:type="spellStart"/>
+      <w:r>
+        <w:rPr>
+          <w:rFonts w:ascii="Arial" w:hAnsi="Arial" w:cs="Arial"/>
+        </w:rPr>
+        <w:t>yyyy</w:t>
+      </w:r>
+      <w:proofErr w:type="spellEnd"/>
+      <w:r>
+        <w:rPr>
+          <w:rFonts w:ascii="Arial" w:hAnsi="Arial" w:cs="Arial"/>
+        </w:rPr>
+        <w:t xml:space="preserve">') if </w:t>
+      </w:r>
+      <w:proofErr w:type="spellStart"/>
+      <w:r>
+        <w:rPr>
+          <w:rFonts w:ascii="Arial" w:hAnsi="Arial" w:cs="Arial"/>
+        </w:rPr>
+        <w:t>case.type</w:t>
+      </w:r>
+      <w:proofErr w:type="spellEnd"/>
+      <w:r>
+        <w:rPr>
+          <w:rFonts w:ascii="Arial" w:hAnsi="Arial" w:cs="Arial"/>
+        </w:rPr>
+        <w:t xml:space="preserve"> not in ["divorce", "</w:t>
+      </w:r>
+      <w:proofErr w:type="spellStart"/>
+      <w:r>
+        <w:rPr>
+          <w:rFonts w:ascii="Arial" w:hAnsi="Arial" w:cs="Arial"/>
+        </w:rPr>
+        <w:t>separate_maintenance</w:t>
+      </w:r>
+      <w:proofErr w:type="spellEnd"/>
+      <w:r>
+        <w:rPr>
+          <w:rFonts w:ascii="Arial" w:hAnsi="Arial" w:cs="Arial"/>
+        </w:rPr>
+        <w:t xml:space="preserve">"] and </w:t>
+      </w:r>
+      <w:proofErr w:type="spellStart"/>
+      <w:r>
+        <w:rPr>
+          <w:rFonts w:ascii="Arial" w:hAnsi="Arial" w:cs="Arial"/>
+        </w:rPr>
+        <w:t>case.status</w:t>
+      </w:r>
+      <w:proofErr w:type="spellEnd"/>
+      <w:r>
+        <w:rPr>
+          <w:rFonts w:ascii="Arial" w:hAnsi="Arial" w:cs="Arial"/>
+        </w:rPr>
+        <w:t xml:space="preserve"> == "</w:t>
+      </w:r>
+      <w:proofErr w:type="spellStart"/>
+      <w:r>
+        <w:rPr>
+          <w:rFonts w:ascii="Arial" w:hAnsi="Arial" w:cs="Arial"/>
+        </w:rPr>
+        <w:t>ended_with_order</w:t>
+      </w:r>
+      <w:proofErr w:type="spellEnd"/>
+      <w:r>
+        <w:rPr>
+          <w:rFonts w:ascii="Arial" w:hAnsi="Arial" w:cs="Arial"/>
+        </w:rPr>
+        <w:t xml:space="preserve">" else </w:t>
+      </w:r>
+      <w:proofErr w:type="spellStart"/>
+      <w:r>
+        <w:rPr>
+          <w:rFonts w:ascii="Arial" w:hAnsi="Arial" w:cs="Arial"/>
+        </w:rPr>
+        <w:t>format_date</w:t>
+      </w:r>
+      <w:proofErr w:type="spellEnd"/>
+      <w:r>
+        <w:rPr>
+          <w:rFonts w:ascii="Arial" w:hAnsi="Arial" w:cs="Arial"/>
+        </w:rPr>
+        <w:t>(</w:t>
+      </w:r>
+      <w:proofErr w:type="spellStart"/>
+      <w:r>
+        <w:rPr>
+          <w:rFonts w:ascii="Arial" w:hAnsi="Arial" w:cs="Arial"/>
+        </w:rPr>
+        <w:t>case.custody_PT_order_date</w:t>
+      </w:r>
+      <w:proofErr w:type="spellEnd"/>
+      <w:r>
+        <w:rPr>
+          <w:rFonts w:ascii="Arial" w:hAnsi="Arial" w:cs="Arial"/>
+        </w:rPr>
+        <w:t>, format='M/d/</w:t>
+      </w:r>
+      <w:proofErr w:type="spellStart"/>
+      <w:r>
+        <w:rPr>
+          <w:rFonts w:ascii="Arial" w:hAnsi="Arial" w:cs="Arial"/>
+        </w:rPr>
+        <w:t>yyyy</w:t>
+      </w:r>
+      <w:proofErr w:type="spellEnd"/>
+      <w:r>
+        <w:rPr>
+          <w:rFonts w:ascii="Arial" w:hAnsi="Arial" w:cs="Arial"/>
+        </w:rPr>
+        <w:t xml:space="preserve">') }}{{ "; This proceeding is continuing." if </w:t>
+      </w:r>
+      <w:proofErr w:type="spellStart"/>
+      <w:r>
+        <w:rPr>
+          <w:rFonts w:ascii="Arial" w:hAnsi="Arial" w:cs="Arial"/>
+        </w:rPr>
+        <w:t>case.status</w:t>
+      </w:r>
+      <w:proofErr w:type="spellEnd"/>
+      <w:r>
+        <w:rPr>
+          <w:rFonts w:ascii="Arial" w:hAnsi="Arial" w:cs="Arial"/>
+        </w:rPr>
+        <w:t xml:space="preserve"> == "pending" else "; This proceeding has been stayed by the court." if </w:t>
+      </w:r>
+      <w:proofErr w:type="spellStart"/>
+      <w:r>
+        <w:rPr>
+          <w:rFonts w:ascii="Arial" w:hAnsi="Arial" w:cs="Arial"/>
+        </w:rPr>
+        <w:t>case.status</w:t>
+      </w:r>
+      <w:proofErr w:type="spellEnd"/>
+      <w:r>
+        <w:rPr>
+          <w:rFonts w:ascii="Arial" w:hAnsi="Arial" w:cs="Arial"/>
+        </w:rPr>
+        <w:t xml:space="preserve"> == "stayed" else "; This proceeding was later dismissed." if </w:t>
+      </w:r>
+      <w:proofErr w:type="spellStart"/>
+      <w:r>
+        <w:rPr>
+          <w:rFonts w:ascii="Arial" w:hAnsi="Arial" w:cs="Arial"/>
+        </w:rPr>
+        <w:t>case.status</w:t>
+      </w:r>
+      <w:proofErr w:type="spellEnd"/>
+      <w:r>
+        <w:rPr>
+          <w:rFonts w:ascii="Arial" w:hAnsi="Arial" w:cs="Arial"/>
+        </w:rPr>
+        <w:t xml:space="preserve"> == "dismissed" else "" }}</w:t>
       </w:r>
     </w:p>
     <w:p>
@@ -407,7 +1061,23 @@
           <w:rFonts w:ascii="Arial" w:hAnsi="Arial" w:cs="Arial"/>
           <w:highlight w:val="magenta"/>
         </w:rPr>
-        <w:t>{%p endfor %}</w:t>
+        <w:t xml:space="preserve">{%p </w:t>
+      </w:r>
+      <w:proofErr w:type="spellStart"/>
+      <w:r>
+        <w:rPr>
+          <w:rFonts w:ascii="Arial" w:hAnsi="Arial" w:cs="Arial"/>
+          <w:highlight w:val="magenta"/>
+        </w:rPr>
+        <w:t>endfor</w:t>
+      </w:r>
+      <w:proofErr w:type="spellEnd"/>
+      <w:r>
+        <w:rPr>
+          <w:rFonts w:ascii="Arial" w:hAnsi="Arial" w:cs="Arial"/>
+          <w:highlight w:val="magenta"/>
+        </w:rPr>
+        <w:t xml:space="preserve"> %}</w:t>
       </w:r>
     </w:p>
     <w:p>
@@ -458,7 +1128,21 @@
         <w:rPr>
           <w:rFonts w:ascii="Arial" w:hAnsi="Arial" w:cs="Arial"/>
         </w:rPr>
-        <w:t>prior_family_cases.filter(</w:t>
+        <w:t>prior_family_</w:t>
+      </w:r>
+      <w:proofErr w:type="gramStart"/>
+      <w:r>
+        <w:rPr>
+          <w:rFonts w:ascii="Arial" w:hAnsi="Arial" w:cs="Arial"/>
+        </w:rPr>
+        <w:t>cases.filter</w:t>
+      </w:r>
+      <w:proofErr w:type="gramEnd"/>
+      <w:r>
+        <w:rPr>
+          <w:rFonts w:ascii="Arial" w:hAnsi="Arial" w:cs="Arial"/>
+        </w:rPr>
+        <w:t>(</w:t>
       </w:r>
       <w:r>
         <w:rPr>
@@ -466,11 +1150,19 @@
         </w:rPr>
         <w:t>not_name_change</w:t>
       </w:r>
-      <w:r>
-        <w:rPr>
-          <w:rFonts w:ascii="Arial" w:hAnsi="Arial" w:cs="Arial"/>
-        </w:rPr>
-        <w:t>).filter(resolved=False)</w:t>
+      <w:proofErr w:type="gramStart"/>
+      <w:r>
+        <w:rPr>
+          <w:rFonts w:ascii="Arial" w:hAnsi="Arial" w:cs="Arial"/>
+        </w:rPr>
+        <w:t>).filter</w:t>
+      </w:r>
+      <w:proofErr w:type="gramEnd"/>
+      <w:r>
+        <w:rPr>
+          <w:rFonts w:ascii="Arial" w:hAnsi="Arial" w:cs="Arial"/>
+        </w:rPr>
+        <w:t>(resolved=False)</w:t>
       </w:r>
       <w:r>
         <w:rPr>
@@ -573,7 +1265,21 @@
         <w:rPr>
           <w:rFonts w:ascii="Arial" w:hAnsi="Arial" w:cs="Arial"/>
         </w:rPr>
-        <w:t xml:space="preserve"> case in prior_family_cases %}</w:t>
+        <w:t xml:space="preserve"> case in </w:t>
+      </w:r>
+      <w:proofErr w:type="spellStart"/>
+      <w:r>
+        <w:rPr>
+          <w:rFonts w:ascii="Arial" w:hAnsi="Arial" w:cs="Arial"/>
+        </w:rPr>
+        <w:t>prior_family_cases</w:t>
+      </w:r>
+      <w:proofErr w:type="spellEnd"/>
+      <w:r>
+        <w:rPr>
+          <w:rFonts w:ascii="Arial" w:hAnsi="Arial" w:cs="Arial"/>
+        </w:rPr>
+        <w:t xml:space="preserve"> %}</w:t>
       </w:r>
     </w:p>
     <w:p>
@@ -610,11 +1316,41 @@
         </w:rPr>
         <w:t xml:space="preserve"> </w:t>
       </w:r>
-      <w:r>
-        <w:rPr>
-          <w:rFonts w:ascii="Arial" w:hAnsi="Arial" w:cs="Arial"/>
-        </w:rPr>
-        <w:t>case.type != "name_change" and</w:t>
+      <w:proofErr w:type="spellStart"/>
+      <w:proofErr w:type="gramStart"/>
+      <w:r>
+        <w:rPr>
+          <w:rFonts w:ascii="Arial" w:hAnsi="Arial" w:cs="Arial"/>
+        </w:rPr>
+        <w:t>case.type</w:t>
+      </w:r>
+      <w:proofErr w:type="spellEnd"/>
+      <w:r>
+        <w:rPr>
+          <w:rFonts w:ascii="Arial" w:hAnsi="Arial" w:cs="Arial"/>
+        </w:rPr>
+        <w:t xml:space="preserve"> !=</w:t>
+      </w:r>
+      <w:proofErr w:type="gramEnd"/>
+      <w:r>
+        <w:rPr>
+          <w:rFonts w:ascii="Arial" w:hAnsi="Arial" w:cs="Arial"/>
+        </w:rPr>
+        <w:t xml:space="preserve"> "</w:t>
+      </w:r>
+      <w:proofErr w:type="spellStart"/>
+      <w:r>
+        <w:rPr>
+          <w:rFonts w:ascii="Arial" w:hAnsi="Arial" w:cs="Arial"/>
+        </w:rPr>
+        <w:t>name_change</w:t>
+      </w:r>
+      <w:proofErr w:type="spellEnd"/>
+      <w:r>
+        <w:rPr>
+          <w:rFonts w:ascii="Arial" w:hAnsi="Arial" w:cs="Arial"/>
+        </w:rPr>
+        <w:t>" and</w:t>
       </w:r>
       <w:r>
         <w:rPr>
@@ -622,11 +1358,21 @@
         </w:rPr>
         <w:t xml:space="preserve"> </w:t>
       </w:r>
-      <w:r>
-        <w:rPr>
-          <w:rFonts w:ascii="Arial" w:hAnsi="Arial" w:cs="Arial"/>
-        </w:rPr>
-        <w:t>case.status in ["pending", "stayed"] %}</w:t>
+      <w:proofErr w:type="spellStart"/>
+      <w:proofErr w:type="gramStart"/>
+      <w:r>
+        <w:rPr>
+          <w:rFonts w:ascii="Arial" w:hAnsi="Arial" w:cs="Arial"/>
+        </w:rPr>
+        <w:t>case.status</w:t>
+      </w:r>
+      <w:proofErr w:type="spellEnd"/>
+      <w:proofErr w:type="gramEnd"/>
+      <w:r>
+        <w:rPr>
+          <w:rFonts w:ascii="Arial" w:hAnsi="Arial" w:cs="Arial"/>
+        </w:rPr>
+        <w:t xml:space="preserve"> in ["pending", "stayed"] %}</w:t>
       </w:r>
     </w:p>
     <w:p>
@@ -641,14 +1387,322 @@
         <w:rPr>
           <w:rFonts w:ascii="Arial" w:hAnsi="Arial" w:cs="Arial"/>
         </w:rPr>
-        <w:t xml:space="preserve">{{ case.title }}; Case #: {{ case.docket_number }}; {{ case.court if case.state != "MI" else court_list.get_court_info_by_2([case.county], ['circuit'], column_1='address_county', column_2='type', return_column='name') }}; {{ case.address if case.state != "MI" else </w:t>
+        <w:t xml:space="preserve">{{ </w:t>
+      </w:r>
+      <w:proofErr w:type="spellStart"/>
+      <w:r>
+        <w:rPr>
+          <w:rFonts w:ascii="Arial" w:hAnsi="Arial" w:cs="Arial"/>
+        </w:rPr>
+        <w:t>case.title</w:t>
+      </w:r>
+      <w:proofErr w:type="spellEnd"/>
+      <w:r>
+        <w:rPr>
+          <w:rFonts w:ascii="Arial" w:hAnsi="Arial" w:cs="Arial"/>
+        </w:rPr>
+        <w:t xml:space="preserve"> }}; Case #: {{ </w:t>
+      </w:r>
+      <w:proofErr w:type="spellStart"/>
+      <w:r>
+        <w:rPr>
+          <w:rFonts w:ascii="Arial" w:hAnsi="Arial" w:cs="Arial"/>
+        </w:rPr>
+        <w:t>case.docket_number</w:t>
+      </w:r>
+      <w:proofErr w:type="spellEnd"/>
+      <w:r>
+        <w:rPr>
+          <w:rFonts w:ascii="Arial" w:hAnsi="Arial" w:cs="Arial"/>
+        </w:rPr>
+        <w:t xml:space="preserve"> }}; {{ </w:t>
+      </w:r>
+      <w:proofErr w:type="spellStart"/>
+      <w:r>
+        <w:rPr>
+          <w:rFonts w:ascii="Arial" w:hAnsi="Arial" w:cs="Arial"/>
+        </w:rPr>
+        <w:t>case.court</w:t>
+      </w:r>
+      <w:proofErr w:type="spellEnd"/>
+      <w:r>
+        <w:rPr>
+          <w:rFonts w:ascii="Arial" w:hAnsi="Arial" w:cs="Arial"/>
+        </w:rPr>
+        <w:t xml:space="preserve"> if </w:t>
+      </w:r>
+      <w:proofErr w:type="spellStart"/>
+      <w:r>
+        <w:rPr>
+          <w:rFonts w:ascii="Arial" w:hAnsi="Arial" w:cs="Arial"/>
+        </w:rPr>
+        <w:t>case.state</w:t>
+      </w:r>
+      <w:proofErr w:type="spellEnd"/>
+      <w:r>
+        <w:rPr>
+          <w:rFonts w:ascii="Arial" w:hAnsi="Arial" w:cs="Arial"/>
+        </w:rPr>
+        <w:t xml:space="preserve"> != "MI" else court_list.get_court_info_by_2([</w:t>
+      </w:r>
+      <w:proofErr w:type="spellStart"/>
+      <w:r>
+        <w:rPr>
+          <w:rFonts w:ascii="Arial" w:hAnsi="Arial" w:cs="Arial"/>
+        </w:rPr>
+        <w:t>case.county</w:t>
+      </w:r>
+      <w:proofErr w:type="spellEnd"/>
+      <w:r>
+        <w:rPr>
+          <w:rFonts w:ascii="Arial" w:hAnsi="Arial" w:cs="Arial"/>
+        </w:rPr>
+        <w:t>], ['circuit'], column_1='</w:t>
+      </w:r>
+      <w:proofErr w:type="spellStart"/>
+      <w:r>
+        <w:rPr>
+          <w:rFonts w:ascii="Arial" w:hAnsi="Arial" w:cs="Arial"/>
+        </w:rPr>
+        <w:t>address_county</w:t>
+      </w:r>
+      <w:proofErr w:type="spellEnd"/>
+      <w:r>
+        <w:rPr>
+          <w:rFonts w:ascii="Arial" w:hAnsi="Arial" w:cs="Arial"/>
+        </w:rPr>
+        <w:t xml:space="preserve">', column_2='type', </w:t>
+      </w:r>
+      <w:proofErr w:type="spellStart"/>
+      <w:r>
+        <w:rPr>
+          <w:rFonts w:ascii="Arial" w:hAnsi="Arial" w:cs="Arial"/>
+        </w:rPr>
+        <w:t>return_column</w:t>
+      </w:r>
+      <w:proofErr w:type="spellEnd"/>
+      <w:r>
+        <w:rPr>
+          <w:rFonts w:ascii="Arial" w:hAnsi="Arial" w:cs="Arial"/>
+        </w:rPr>
+        <w:t xml:space="preserve">='name') }}; {{ </w:t>
+      </w:r>
+      <w:proofErr w:type="spellStart"/>
+      <w:r>
+        <w:rPr>
+          <w:rFonts w:ascii="Arial" w:hAnsi="Arial" w:cs="Arial"/>
+        </w:rPr>
+        <w:t>case.address</w:t>
+      </w:r>
+      <w:proofErr w:type="spellEnd"/>
+      <w:r>
+        <w:rPr>
+          <w:rFonts w:ascii="Arial" w:hAnsi="Arial" w:cs="Arial"/>
+        </w:rPr>
+        <w:t xml:space="preserve"> if </w:t>
+      </w:r>
+      <w:proofErr w:type="spellStart"/>
+      <w:r>
+        <w:rPr>
+          <w:rFonts w:ascii="Arial" w:hAnsi="Arial" w:cs="Arial"/>
+        </w:rPr>
+        <w:t>case.state</w:t>
+      </w:r>
+      <w:proofErr w:type="spellEnd"/>
+      <w:r>
+        <w:rPr>
+          <w:rFonts w:ascii="Arial" w:hAnsi="Arial" w:cs="Arial"/>
+        </w:rPr>
+        <w:t xml:space="preserve"> != "MI" else </w:t>
       </w:r>
       <w:r>
         <w:rPr>
           <w:rFonts w:ascii="Arial" w:hAnsi="Arial" w:cs="Arial"/>
         </w:rPr>
         <w:lastRenderedPageBreak/>
-        <w:t>court_list.get_court_info_by_2([case.county], ['circuit'], column_1='address_county', column_2='type', return_column='address_address') ~ " " ~ court_list.get_court_info_by_2([case.county], ['circuit'], column_1='address_county', column_2='type', return_column='address_unit') ~ ", " ~ court_list.get_court_info_by_2([case.county], ['circuit'], column_1='address_county', column_2='type', return_column='CSZ') }}; Nature: {{ prior_family_case_types_ordered[case.type] }}</w:t>
+        <w:t>court_list.get_court_info_by_2([</w:t>
+      </w:r>
+      <w:proofErr w:type="spellStart"/>
+      <w:r>
+        <w:rPr>
+          <w:rFonts w:ascii="Arial" w:hAnsi="Arial" w:cs="Arial"/>
+        </w:rPr>
+        <w:t>case.county</w:t>
+      </w:r>
+      <w:proofErr w:type="spellEnd"/>
+      <w:r>
+        <w:rPr>
+          <w:rFonts w:ascii="Arial" w:hAnsi="Arial" w:cs="Arial"/>
+        </w:rPr>
+        <w:t>], ['circuit'], column_1='</w:t>
+      </w:r>
+      <w:proofErr w:type="spellStart"/>
+      <w:r>
+        <w:rPr>
+          <w:rFonts w:ascii="Arial" w:hAnsi="Arial" w:cs="Arial"/>
+        </w:rPr>
+        <w:t>address_county</w:t>
+      </w:r>
+      <w:proofErr w:type="spellEnd"/>
+      <w:r>
+        <w:rPr>
+          <w:rFonts w:ascii="Arial" w:hAnsi="Arial" w:cs="Arial"/>
+        </w:rPr>
+        <w:t xml:space="preserve">', column_2='type', </w:t>
+      </w:r>
+      <w:proofErr w:type="spellStart"/>
+      <w:r>
+        <w:rPr>
+          <w:rFonts w:ascii="Arial" w:hAnsi="Arial" w:cs="Arial"/>
+        </w:rPr>
+        <w:t>return_column</w:t>
+      </w:r>
+      <w:proofErr w:type="spellEnd"/>
+      <w:r>
+        <w:rPr>
+          <w:rFonts w:ascii="Arial" w:hAnsi="Arial" w:cs="Arial"/>
+        </w:rPr>
+        <w:t>='</w:t>
+      </w:r>
+      <w:proofErr w:type="spellStart"/>
+      <w:r>
+        <w:rPr>
+          <w:rFonts w:ascii="Arial" w:hAnsi="Arial" w:cs="Arial"/>
+        </w:rPr>
+        <w:t>address_address</w:t>
+      </w:r>
+      <w:proofErr w:type="spellEnd"/>
+      <w:r>
+        <w:rPr>
+          <w:rFonts w:ascii="Arial" w:hAnsi="Arial" w:cs="Arial"/>
+        </w:rPr>
+        <w:t>') ~ " " ~ court_list.get_court_info_by_2([</w:t>
+      </w:r>
+      <w:proofErr w:type="spellStart"/>
+      <w:r>
+        <w:rPr>
+          <w:rFonts w:ascii="Arial" w:hAnsi="Arial" w:cs="Arial"/>
+        </w:rPr>
+        <w:t>case.county</w:t>
+      </w:r>
+      <w:proofErr w:type="spellEnd"/>
+      <w:r>
+        <w:rPr>
+          <w:rFonts w:ascii="Arial" w:hAnsi="Arial" w:cs="Arial"/>
+        </w:rPr>
+        <w:t>], ['circuit'], column_1='</w:t>
+      </w:r>
+      <w:proofErr w:type="spellStart"/>
+      <w:r>
+        <w:rPr>
+          <w:rFonts w:ascii="Arial" w:hAnsi="Arial" w:cs="Arial"/>
+        </w:rPr>
+        <w:t>address_county</w:t>
+      </w:r>
+      <w:proofErr w:type="spellEnd"/>
+      <w:r>
+        <w:rPr>
+          <w:rFonts w:ascii="Arial" w:hAnsi="Arial" w:cs="Arial"/>
+        </w:rPr>
+        <w:t xml:space="preserve">', column_2='type', </w:t>
+      </w:r>
+      <w:proofErr w:type="spellStart"/>
+      <w:r>
+        <w:rPr>
+          <w:rFonts w:ascii="Arial" w:hAnsi="Arial" w:cs="Arial"/>
+        </w:rPr>
+        <w:t>return_column</w:t>
+      </w:r>
+      <w:proofErr w:type="spellEnd"/>
+      <w:r>
+        <w:rPr>
+          <w:rFonts w:ascii="Arial" w:hAnsi="Arial" w:cs="Arial"/>
+        </w:rPr>
+        <w:t>='</w:t>
+      </w:r>
+      <w:proofErr w:type="spellStart"/>
+      <w:r>
+        <w:rPr>
+          <w:rFonts w:ascii="Arial" w:hAnsi="Arial" w:cs="Arial"/>
+        </w:rPr>
+        <w:t>address_unit</w:t>
+      </w:r>
+      <w:proofErr w:type="spellEnd"/>
+      <w:r>
+        <w:rPr>
+          <w:rFonts w:ascii="Arial" w:hAnsi="Arial" w:cs="Arial"/>
+        </w:rPr>
+        <w:t>') ~ ", " ~ court_list.get_court_info_by_2([</w:t>
+      </w:r>
+      <w:proofErr w:type="spellStart"/>
+      <w:r>
+        <w:rPr>
+          <w:rFonts w:ascii="Arial" w:hAnsi="Arial" w:cs="Arial"/>
+        </w:rPr>
+        <w:t>case.county</w:t>
+      </w:r>
+      <w:proofErr w:type="spellEnd"/>
+      <w:r>
+        <w:rPr>
+          <w:rFonts w:ascii="Arial" w:hAnsi="Arial" w:cs="Arial"/>
+        </w:rPr>
+        <w:t>], ['circuit'], column_1='</w:t>
+      </w:r>
+      <w:proofErr w:type="spellStart"/>
+      <w:r>
+        <w:rPr>
+          <w:rFonts w:ascii="Arial" w:hAnsi="Arial" w:cs="Arial"/>
+        </w:rPr>
+        <w:t>address_county</w:t>
+      </w:r>
+      <w:proofErr w:type="spellEnd"/>
+      <w:r>
+        <w:rPr>
+          <w:rFonts w:ascii="Arial" w:hAnsi="Arial" w:cs="Arial"/>
+        </w:rPr>
+        <w:t xml:space="preserve">', column_2='type', </w:t>
+      </w:r>
+      <w:proofErr w:type="spellStart"/>
+      <w:r>
+        <w:rPr>
+          <w:rFonts w:ascii="Arial" w:hAnsi="Arial" w:cs="Arial"/>
+        </w:rPr>
+        <w:t>return_column</w:t>
+      </w:r>
+      <w:proofErr w:type="spellEnd"/>
+      <w:r>
+        <w:rPr>
+          <w:rFonts w:ascii="Arial" w:hAnsi="Arial" w:cs="Arial"/>
+        </w:rPr>
+        <w:t xml:space="preserve">='CSZ') }}; Nature: {{ </w:t>
+      </w:r>
+      <w:proofErr w:type="spellStart"/>
+      <w:r>
+        <w:rPr>
+          <w:rFonts w:ascii="Arial" w:hAnsi="Arial" w:cs="Arial"/>
+        </w:rPr>
+        <w:t>prior_family_case_types_ordered</w:t>
+      </w:r>
+      <w:proofErr w:type="spellEnd"/>
+      <w:r>
+        <w:rPr>
+          <w:rFonts w:ascii="Arial" w:hAnsi="Arial" w:cs="Arial"/>
+        </w:rPr>
+        <w:t>[</w:t>
+      </w:r>
+      <w:proofErr w:type="spellStart"/>
+      <w:r>
+        <w:rPr>
+          <w:rFonts w:ascii="Arial" w:hAnsi="Arial" w:cs="Arial"/>
+        </w:rPr>
+        <w:t>case.type</w:t>
+      </w:r>
+      <w:proofErr w:type="spellEnd"/>
+      <w:r>
+        <w:rPr>
+          <w:rFonts w:ascii="Arial" w:hAnsi="Arial" w:cs="Arial"/>
+        </w:rPr>
+        <w:t>] }}</w:t>
       </w:r>
       <w:r>
         <w:rPr>
@@ -660,7 +1714,105 @@
         <w:rPr>
           <w:rFonts w:ascii="Arial" w:hAnsi="Arial" w:cs="Arial"/>
         </w:rPr>
-        <w:t>(case.type == "separate_maintenance" and case.involved_custody_pt_support and case.included_custody_PT_order) or (case.type != "separate_maintenance" and case.included_custody_PT_order)</w:t>
+        <w:t>(</w:t>
+      </w:r>
+      <w:proofErr w:type="spellStart"/>
+      <w:r>
+        <w:rPr>
+          <w:rFonts w:ascii="Arial" w:hAnsi="Arial" w:cs="Arial"/>
+        </w:rPr>
+        <w:t>case.type</w:t>
+      </w:r>
+      <w:proofErr w:type="spellEnd"/>
+      <w:r>
+        <w:rPr>
+          <w:rFonts w:ascii="Arial" w:hAnsi="Arial" w:cs="Arial"/>
+        </w:rPr>
+        <w:t xml:space="preserve"> == "</w:t>
+      </w:r>
+      <w:proofErr w:type="spellStart"/>
+      <w:r>
+        <w:rPr>
+          <w:rFonts w:ascii="Arial" w:hAnsi="Arial" w:cs="Arial"/>
+        </w:rPr>
+        <w:t>separate_maintenance</w:t>
+      </w:r>
+      <w:proofErr w:type="spellEnd"/>
+      <w:r>
+        <w:rPr>
+          <w:rFonts w:ascii="Arial" w:hAnsi="Arial" w:cs="Arial"/>
+        </w:rPr>
+        <w:t xml:space="preserve">" and </w:t>
+      </w:r>
+      <w:proofErr w:type="spellStart"/>
+      <w:r>
+        <w:rPr>
+          <w:rFonts w:ascii="Arial" w:hAnsi="Arial" w:cs="Arial"/>
+        </w:rPr>
+        <w:t>case.involved_custody_pt_support</w:t>
+      </w:r>
+      <w:proofErr w:type="spellEnd"/>
+      <w:r>
+        <w:rPr>
+          <w:rFonts w:ascii="Arial" w:hAnsi="Arial" w:cs="Arial"/>
+        </w:rPr>
+        <w:t xml:space="preserve"> and </w:t>
+      </w:r>
+      <w:proofErr w:type="spellStart"/>
+      <w:r>
+        <w:rPr>
+          <w:rFonts w:ascii="Arial" w:hAnsi="Arial" w:cs="Arial"/>
+        </w:rPr>
+        <w:t>case.included_custody_PT_order</w:t>
+      </w:r>
+      <w:proofErr w:type="spellEnd"/>
+      <w:r>
+        <w:rPr>
+          <w:rFonts w:ascii="Arial" w:hAnsi="Arial" w:cs="Arial"/>
+        </w:rPr>
+        <w:t>) or (</w:t>
+      </w:r>
+      <w:proofErr w:type="spellStart"/>
+      <w:r>
+        <w:rPr>
+          <w:rFonts w:ascii="Arial" w:hAnsi="Arial" w:cs="Arial"/>
+        </w:rPr>
+        <w:t>case.type</w:t>
+      </w:r>
+      <w:proofErr w:type="spellEnd"/>
+      <w:r>
+        <w:rPr>
+          <w:rFonts w:ascii="Arial" w:hAnsi="Arial" w:cs="Arial"/>
+        </w:rPr>
+        <w:t xml:space="preserve"> != "</w:t>
+      </w:r>
+      <w:proofErr w:type="spellStart"/>
+      <w:r>
+        <w:rPr>
+          <w:rFonts w:ascii="Arial" w:hAnsi="Arial" w:cs="Arial"/>
+        </w:rPr>
+        <w:t>separate_maintenance</w:t>
+      </w:r>
+      <w:proofErr w:type="spellEnd"/>
+      <w:r>
+        <w:rPr>
+          <w:rFonts w:ascii="Arial" w:hAnsi="Arial" w:cs="Arial"/>
+        </w:rPr>
+        <w:t xml:space="preserve">" and </w:t>
+      </w:r>
+      <w:proofErr w:type="spellStart"/>
+      <w:r>
+        <w:rPr>
+          <w:rFonts w:ascii="Arial" w:hAnsi="Arial" w:cs="Arial"/>
+        </w:rPr>
+        <w:t>case.included_custody_PT_order</w:t>
+      </w:r>
+      <w:proofErr w:type="spellEnd"/>
+      <w:r>
+        <w:rPr>
+          <w:rFonts w:ascii="Arial" w:hAnsi="Arial" w:cs="Arial"/>
+        </w:rPr>
+        <w:t>)</w:t>
       </w:r>
       <w:r>
         <w:rPr>
@@ -674,11 +1826,47 @@
         </w:rPr>
         <w:t xml:space="preserve">; Order date: {{ </w:t>
       </w:r>
-      <w:r>
-        <w:rPr>
-          <w:rFonts w:ascii="Arial" w:hAnsi="Arial" w:cs="Arial"/>
-        </w:rPr>
-        <w:t>format_date(case.custody_PT_order_date, format='M/d/yyyy')</w:t>
+      <w:proofErr w:type="spellStart"/>
+      <w:r>
+        <w:rPr>
+          <w:rFonts w:ascii="Arial" w:hAnsi="Arial" w:cs="Arial"/>
+        </w:rPr>
+        <w:t>format_date</w:t>
+      </w:r>
+      <w:proofErr w:type="spellEnd"/>
+      <w:r>
+        <w:rPr>
+          <w:rFonts w:ascii="Arial" w:hAnsi="Arial" w:cs="Arial"/>
+        </w:rPr>
+        <w:t>(</w:t>
+      </w:r>
+      <w:proofErr w:type="spellStart"/>
+      <w:r>
+        <w:rPr>
+          <w:rFonts w:ascii="Arial" w:hAnsi="Arial" w:cs="Arial"/>
+        </w:rPr>
+        <w:t>case.custody_PT_order_date</w:t>
+      </w:r>
+      <w:proofErr w:type="spellEnd"/>
+      <w:r>
+        <w:rPr>
+          <w:rFonts w:ascii="Arial" w:hAnsi="Arial" w:cs="Arial"/>
+        </w:rPr>
+        <w:t>, format='M/d/</w:t>
+      </w:r>
+      <w:proofErr w:type="spellStart"/>
+      <w:r>
+        <w:rPr>
+          <w:rFonts w:ascii="Arial" w:hAnsi="Arial" w:cs="Arial"/>
+        </w:rPr>
+        <w:t>yyyy</w:t>
+      </w:r>
+      <w:proofErr w:type="spellEnd"/>
+      <w:r>
+        <w:rPr>
+          <w:rFonts w:ascii="Arial" w:hAnsi="Arial" w:cs="Arial"/>
+        </w:rPr>
+        <w:t>')</w:t>
       </w:r>
       <w:r>
         <w:rPr>
@@ -696,7 +1884,21 @@
         <w:rPr>
           <w:rFonts w:ascii="Arial" w:hAnsi="Arial" w:cs="Arial"/>
         </w:rPr>
-        <w:t>{{ "; This proceeding is continuing." if case.status == "pending" else "; This proceeding has been stayed by the court." }}</w:t>
+        <w:t xml:space="preserve">{{ "; This proceeding is continuing." if </w:t>
+      </w:r>
+      <w:proofErr w:type="spellStart"/>
+      <w:r>
+        <w:rPr>
+          <w:rFonts w:ascii="Arial" w:hAnsi="Arial" w:cs="Arial"/>
+        </w:rPr>
+        <w:t>case.status</w:t>
+      </w:r>
+      <w:proofErr w:type="spellEnd"/>
+      <w:r>
+        <w:rPr>
+          <w:rFonts w:ascii="Arial" w:hAnsi="Arial" w:cs="Arial"/>
+        </w:rPr>
+        <w:t xml:space="preserve"> == "pending" else "; This proceeding has been stayed by the court." }}</w:t>
       </w:r>
     </w:p>
     <w:p>
@@ -754,7 +1956,23 @@
           <w:rFonts w:ascii="Arial" w:hAnsi="Arial" w:cs="Arial"/>
           <w:highlight w:val="magenta"/>
         </w:rPr>
-        <w:t xml:space="preserve"> endfor %}</w:t>
+        <w:t xml:space="preserve"> </w:t>
+      </w:r>
+      <w:proofErr w:type="spellStart"/>
+      <w:r>
+        <w:rPr>
+          <w:rFonts w:ascii="Arial" w:hAnsi="Arial" w:cs="Arial"/>
+          <w:highlight w:val="magenta"/>
+        </w:rPr>
+        <w:t>endfor</w:t>
+      </w:r>
+      <w:proofErr w:type="spellEnd"/>
+      <w:r>
+        <w:rPr>
+          <w:rFonts w:ascii="Arial" w:hAnsi="Arial" w:cs="Arial"/>
+          <w:highlight w:val="magenta"/>
+        </w:rPr>
+        <w:t xml:space="preserve"> %}</w:t>
       </w:r>
     </w:p>
     <w:p>
@@ -800,7 +2018,51 @@
         <w:rPr>
           <w:rFonts w:ascii="Arial" w:hAnsi="Arial" w:cs="Arial"/>
         </w:rPr>
-        <w:t xml:space="preserve"> not MI_home_state_all_kids and children.filter(legal_parent='both') | length &gt; 1 %}</w:t>
+        <w:t xml:space="preserve"> not </w:t>
+      </w:r>
+      <w:proofErr w:type="spellStart"/>
+      <w:r>
+        <w:rPr>
+          <w:rFonts w:ascii="Arial" w:hAnsi="Arial" w:cs="Arial"/>
+        </w:rPr>
+        <w:t>MI_home_state_all_kids</w:t>
+      </w:r>
+      <w:proofErr w:type="spellEnd"/>
+      <w:r>
+        <w:rPr>
+          <w:rFonts w:ascii="Arial" w:hAnsi="Arial" w:cs="Arial"/>
+        </w:rPr>
+        <w:t xml:space="preserve"> and </w:t>
+      </w:r>
+      <w:proofErr w:type="spellStart"/>
+      <w:proofErr w:type="gramStart"/>
+      <w:r>
+        <w:rPr>
+          <w:rFonts w:ascii="Arial" w:hAnsi="Arial" w:cs="Arial"/>
+        </w:rPr>
+        <w:t>children.filter</w:t>
+      </w:r>
+      <w:proofErr w:type="spellEnd"/>
+      <w:proofErr w:type="gramEnd"/>
+      <w:r>
+        <w:rPr>
+          <w:rFonts w:ascii="Arial" w:hAnsi="Arial" w:cs="Arial"/>
+        </w:rPr>
+        <w:t>(</w:t>
+      </w:r>
+      <w:proofErr w:type="spellStart"/>
+      <w:r>
+        <w:rPr>
+          <w:rFonts w:ascii="Arial" w:hAnsi="Arial" w:cs="Arial"/>
+        </w:rPr>
+        <w:t>legal_parent</w:t>
+      </w:r>
+      <w:proofErr w:type="spellEnd"/>
+      <w:r>
+        <w:rPr>
+          <w:rFonts w:ascii="Arial" w:hAnsi="Arial" w:cs="Arial"/>
+        </w:rPr>
+        <w:t>='both') | length &gt; 1 %}</w:t>
       </w:r>
     </w:p>
     <w:p>
@@ -848,11 +2110,35 @@
         </w:rPr>
         <w:t xml:space="preserve">child in </w:t>
       </w:r>
-      <w:r>
-        <w:rPr>
-          <w:rFonts w:ascii="Arial" w:hAnsi="Arial" w:cs="Arial"/>
-        </w:rPr>
-        <w:t>children.filter(legal_parent='both'</w:t>
+      <w:proofErr w:type="spellStart"/>
+      <w:proofErr w:type="gramStart"/>
+      <w:r>
+        <w:rPr>
+          <w:rFonts w:ascii="Arial" w:hAnsi="Arial" w:cs="Arial"/>
+        </w:rPr>
+        <w:t>children.filter</w:t>
+      </w:r>
+      <w:proofErr w:type="spellEnd"/>
+      <w:proofErr w:type="gramEnd"/>
+      <w:r>
+        <w:rPr>
+          <w:rFonts w:ascii="Arial" w:hAnsi="Arial" w:cs="Arial"/>
+        </w:rPr>
+        <w:t>(</w:t>
+      </w:r>
+      <w:proofErr w:type="spellStart"/>
+      <w:r>
+        <w:rPr>
+          <w:rFonts w:ascii="Arial" w:hAnsi="Arial" w:cs="Arial"/>
+        </w:rPr>
+        <w:t>legal_parent</w:t>
+      </w:r>
+      <w:proofErr w:type="spellEnd"/>
+      <w:r>
+        <w:rPr>
+          <w:rFonts w:ascii="Arial" w:hAnsi="Arial" w:cs="Arial"/>
+        </w:rPr>
+        <w:t>='both'</w:t>
       </w:r>
       <w:r>
         <w:rPr>
@@ -866,7 +2152,7 @@
         <w:pStyle w:val="ListParagraph"/>
         <w:numPr>
           <w:ilvl w:val="0"/>
-          <w:numId w:val="5"/>
+          <w:numId w:val="6"/>
         </w:numPr>
         <w:spacing w:after="0" w:line="240" w:lineRule="auto"/>
         <w:rPr>
@@ -879,113 +2165,365 @@
         </w:rPr>
         <w:t xml:space="preserve">{% if </w:t>
       </w:r>
-      <w:r>
-        <w:rPr>
-          <w:rFonts w:ascii="Arial" w:hAnsi="Arial" w:cs="Arial"/>
-        </w:rPr>
-        <w:t>child.home_state == "</w:t>
-      </w:r>
-      <w:r>
-        <w:rPr>
-          <w:rFonts w:ascii="Arial" w:hAnsi="Arial" w:cs="Arial"/>
-        </w:rPr>
-        <w:t>n</w:t>
-      </w:r>
-      <w:r>
-        <w:rPr>
-          <w:rFonts w:ascii="Arial" w:hAnsi="Arial" w:cs="Arial"/>
-        </w:rPr>
-        <w:t xml:space="preserve">one" and child.MI_jurisdiction </w:t>
-      </w:r>
-      <w:r>
-        <w:rPr>
-          <w:rFonts w:ascii="Arial" w:hAnsi="Arial" w:cs="Arial"/>
-        </w:rPr>
-        <w:t>%}n</w:t>
-      </w:r>
-      <w:r>
-        <w:rPr>
-          <w:rFonts w:ascii="Arial" w:hAnsi="Arial" w:cs="Arial"/>
-        </w:rPr>
-        <w:t>one</w:t>
-      </w:r>
-      <w:r>
-        <w:rPr>
-          <w:rFonts w:ascii="Arial" w:hAnsi="Arial" w:cs="Arial"/>
-        </w:rPr>
-        <w:t xml:space="preserve"> for {{ child }}</w:t>
-      </w:r>
-      <w:r>
-        <w:rPr>
-          <w:rFonts w:ascii="Arial" w:hAnsi="Arial" w:cs="Arial"/>
-        </w:rPr>
-        <w:t xml:space="preserve">. </w:t>
-      </w:r>
-      <w:r>
-        <w:rPr>
-          <w:rFonts w:ascii="Arial" w:hAnsi="Arial" w:cs="Arial"/>
-        </w:rPr>
-        <w:t xml:space="preserve">However, </w:t>
-      </w:r>
-      <w:r>
-        <w:rPr>
-          <w:rFonts w:ascii="Arial" w:hAnsi="Arial" w:cs="Arial"/>
-        </w:rPr>
-        <w:t xml:space="preserve">Michigan has jurisdiction because </w:t>
-      </w:r>
-      <w:r>
-        <w:rPr>
-          <w:rFonts w:ascii="Arial" w:hAnsi="Arial" w:cs="Arial"/>
-        </w:rPr>
-        <w:t xml:space="preserve">{{ child }} </w:t>
-      </w:r>
-      <w:r>
-        <w:rPr>
-          <w:rFonts w:ascii="Arial" w:hAnsi="Arial" w:cs="Arial"/>
-        </w:rPr>
-        <w:t xml:space="preserve">lived 6 months in MI </w:t>
-      </w:r>
-      <w:r>
-        <w:rPr>
-          <w:rFonts w:ascii="Arial" w:hAnsi="Arial" w:cs="Arial"/>
-        </w:rPr>
-        <w:t xml:space="preserve">ending </w:t>
-      </w:r>
-      <w:r>
-        <w:rPr>
-          <w:rFonts w:ascii="Arial" w:hAnsi="Arial" w:cs="Arial"/>
-        </w:rPr>
-        <w:t xml:space="preserve">within the last 6 months. </w:t>
-      </w:r>
-      <w:r>
-        <w:rPr>
-          <w:rFonts w:ascii="Arial" w:hAnsi="Arial" w:cs="Arial"/>
-        </w:rPr>
-        <w:t>MCL 722.1201(1)(a)</w:t>
-      </w:r>
-      <w:r>
-        <w:rPr>
-          <w:rFonts w:ascii="Arial" w:hAnsi="Arial" w:cs="Arial"/>
-        </w:rPr>
-        <w:t>.{%</w:t>
-      </w:r>
-      <w:r>
-        <w:rPr>
-          <w:rFonts w:ascii="Arial" w:hAnsi="Arial" w:cs="Arial"/>
-        </w:rPr>
-        <w:t xml:space="preserve"> else </w:t>
-      </w:r>
-      <w:r>
-        <w:rPr>
-          <w:rFonts w:ascii="Arial" w:hAnsi="Arial" w:cs="Arial"/>
-        </w:rPr>
-        <w:t>%}{{</w:t>
-      </w:r>
-      <w:r>
-        <w:rPr>
-          <w:rFonts w:ascii="Arial" w:hAnsi="Arial" w:cs="Arial"/>
-        </w:rPr>
-        <w:t>child.home_state }} for {{ child }}</w:t>
+      <w:proofErr w:type="spellStart"/>
+      <w:proofErr w:type="gramStart"/>
+      <w:r>
+        <w:rPr>
+          <w:rFonts w:ascii="Arial" w:hAnsi="Arial" w:cs="Arial"/>
+        </w:rPr>
+        <w:t>child.home</w:t>
+      </w:r>
+      <w:proofErr w:type="gramEnd"/>
+      <w:r>
+        <w:rPr>
+          <w:rFonts w:ascii="Arial" w:hAnsi="Arial" w:cs="Arial"/>
+        </w:rPr>
+        <w:t>_state</w:t>
+      </w:r>
+      <w:proofErr w:type="spellEnd"/>
+      <w:r>
+        <w:rPr>
+          <w:rFonts w:ascii="Arial" w:hAnsi="Arial" w:cs="Arial"/>
+        </w:rPr>
+        <w:t xml:space="preserve"> == "none" and </w:t>
+      </w:r>
+      <w:proofErr w:type="spellStart"/>
+      <w:r>
+        <w:rPr>
+          <w:rFonts w:ascii="Arial" w:hAnsi="Arial" w:cs="Arial"/>
+        </w:rPr>
+        <w:t>child.MI_jurisdiction</w:t>
+      </w:r>
+      <w:proofErr w:type="spellEnd"/>
+      <w:r>
+        <w:rPr>
+          <w:rFonts w:ascii="Arial" w:hAnsi="Arial" w:cs="Arial"/>
+        </w:rPr>
+        <w:t xml:space="preserve"> </w:t>
+      </w:r>
+      <w:proofErr w:type="gramStart"/>
+      <w:r>
+        <w:rPr>
+          <w:rFonts w:ascii="Arial" w:hAnsi="Arial" w:cs="Arial"/>
+        </w:rPr>
+        <w:t>%}</w:t>
+      </w:r>
+      <w:r>
+        <w:rPr>
+          <w:rFonts w:ascii="Arial" w:hAnsi="Arial" w:cs="Arial"/>
+        </w:rPr>
+        <w:t>None</w:t>
+      </w:r>
+      <w:proofErr w:type="gramEnd"/>
+      <w:r>
+        <w:rPr>
+          <w:rFonts w:ascii="Arial" w:hAnsi="Arial" w:cs="Arial"/>
+        </w:rPr>
+        <w:t xml:space="preserve"> for </w:t>
+      </w:r>
+      <w:proofErr w:type="gramStart"/>
+      <w:r>
+        <w:rPr>
+          <w:rFonts w:ascii="Arial" w:hAnsi="Arial" w:cs="Arial"/>
+        </w:rPr>
+        <w:t>{{ child</w:t>
+      </w:r>
+      <w:proofErr w:type="gramEnd"/>
+      <w:r>
+        <w:rPr>
+          <w:rFonts w:ascii="Arial" w:hAnsi="Arial" w:cs="Arial"/>
+        </w:rPr>
+        <w:t xml:space="preserve"> }}. However, Michigan has jurisdiction because </w:t>
+      </w:r>
+      <w:proofErr w:type="gramStart"/>
+      <w:r>
+        <w:rPr>
+          <w:rFonts w:ascii="Arial" w:hAnsi="Arial" w:cs="Arial"/>
+        </w:rPr>
+        <w:t>{{ child</w:t>
+      </w:r>
+      <w:proofErr w:type="gramEnd"/>
+      <w:r>
+        <w:rPr>
+          <w:rFonts w:ascii="Arial" w:hAnsi="Arial" w:cs="Arial"/>
+        </w:rPr>
+        <w:t xml:space="preserve"> }} lived 6 months in MI ending within the last 6 months. MCL 722.1201(1)(a</w:t>
+      </w:r>
+      <w:proofErr w:type="gramStart"/>
+      <w:r>
+        <w:rPr>
+          <w:rFonts w:ascii="Arial" w:hAnsi="Arial" w:cs="Arial"/>
+        </w:rPr>
+        <w:t>).{</w:t>
+      </w:r>
+      <w:proofErr w:type="gramEnd"/>
+      <w:r>
+        <w:rPr>
+          <w:rFonts w:ascii="Arial" w:hAnsi="Arial" w:cs="Arial"/>
+        </w:rPr>
+        <w:t xml:space="preserve">% </w:t>
+      </w:r>
+      <w:proofErr w:type="spellStart"/>
+      <w:r>
+        <w:rPr>
+          <w:rFonts w:ascii="Arial" w:hAnsi="Arial" w:cs="Arial"/>
+        </w:rPr>
+        <w:t>elif</w:t>
+      </w:r>
+      <w:proofErr w:type="spellEnd"/>
+      <w:r>
+        <w:rPr>
+          <w:rFonts w:ascii="Arial" w:hAnsi="Arial" w:cs="Arial"/>
+        </w:rPr>
+        <w:t xml:space="preserve"> </w:t>
+      </w:r>
+      <w:proofErr w:type="spellStart"/>
+      <w:proofErr w:type="gramStart"/>
+      <w:r>
+        <w:rPr>
+          <w:rFonts w:ascii="Arial" w:hAnsi="Arial" w:cs="Arial"/>
+        </w:rPr>
+        <w:t>child.home</w:t>
+      </w:r>
+      <w:proofErr w:type="gramEnd"/>
+      <w:r>
+        <w:rPr>
+          <w:rFonts w:ascii="Arial" w:hAnsi="Arial" w:cs="Arial"/>
+        </w:rPr>
+        <w:t>_state</w:t>
+      </w:r>
+      <w:proofErr w:type="spellEnd"/>
+      <w:r>
+        <w:rPr>
+          <w:rFonts w:ascii="Arial" w:hAnsi="Arial" w:cs="Arial"/>
+        </w:rPr>
+        <w:t xml:space="preserve"> == "none" and not </w:t>
+      </w:r>
+      <w:proofErr w:type="spellStart"/>
+      <w:r>
+        <w:rPr>
+          <w:rFonts w:ascii="Arial" w:hAnsi="Arial" w:cs="Arial"/>
+        </w:rPr>
+        <w:t>child.MI_jurisdiction</w:t>
+      </w:r>
+      <w:proofErr w:type="spellEnd"/>
+      <w:r>
+        <w:rPr>
+          <w:rFonts w:ascii="Arial" w:hAnsi="Arial" w:cs="Arial"/>
+        </w:rPr>
+        <w:t xml:space="preserve"> and </w:t>
+      </w:r>
+      <w:proofErr w:type="spellStart"/>
+      <w:proofErr w:type="gramStart"/>
+      <w:r>
+        <w:rPr>
+          <w:rFonts w:ascii="Arial" w:hAnsi="Arial" w:cs="Arial"/>
+        </w:rPr>
+        <w:t>child.currently</w:t>
+      </w:r>
+      <w:proofErr w:type="gramEnd"/>
+      <w:r>
+        <w:rPr>
+          <w:rFonts w:ascii="Arial" w:hAnsi="Arial" w:cs="Arial"/>
+        </w:rPr>
+        <w:t>_resides_in_type</w:t>
+      </w:r>
+      <w:proofErr w:type="spellEnd"/>
+      <w:r>
+        <w:rPr>
+          <w:rFonts w:ascii="Arial" w:hAnsi="Arial" w:cs="Arial"/>
+        </w:rPr>
+        <w:t xml:space="preserve"> == "Michigan" and </w:t>
+      </w:r>
+      <w:proofErr w:type="spellStart"/>
+      <w:r>
+        <w:rPr>
+          <w:rFonts w:ascii="Arial" w:hAnsi="Arial" w:cs="Arial"/>
+        </w:rPr>
+        <w:t>child.age_in_</w:t>
+      </w:r>
+      <w:proofErr w:type="gramStart"/>
+      <w:r>
+        <w:rPr>
+          <w:rFonts w:ascii="Arial" w:hAnsi="Arial" w:cs="Arial"/>
+        </w:rPr>
+        <w:t>months</w:t>
+      </w:r>
+      <w:proofErr w:type="spellEnd"/>
+      <w:r>
+        <w:rPr>
+          <w:rFonts w:ascii="Arial" w:hAnsi="Arial" w:cs="Arial"/>
+        </w:rPr>
+        <w:t>(</w:t>
+      </w:r>
+      <w:proofErr w:type="gramEnd"/>
+      <w:r>
+        <w:rPr>
+          <w:rFonts w:ascii="Arial" w:hAnsi="Arial" w:cs="Arial"/>
+        </w:rPr>
+        <w:t xml:space="preserve">) &gt;= 6 and not </w:t>
+      </w:r>
+      <w:proofErr w:type="spellStart"/>
+      <w:proofErr w:type="gramStart"/>
+      <w:r>
+        <w:rPr>
+          <w:rFonts w:ascii="Arial" w:hAnsi="Arial" w:cs="Arial"/>
+        </w:rPr>
+        <w:t>child.current</w:t>
+      </w:r>
+      <w:proofErr w:type="gramEnd"/>
+      <w:r>
+        <w:rPr>
+          <w:rFonts w:ascii="Arial" w:hAnsi="Arial" w:cs="Arial"/>
+        </w:rPr>
+        <w:t>_residence_is_home_state</w:t>
+      </w:r>
+      <w:proofErr w:type="spellEnd"/>
+      <w:r>
+        <w:rPr>
+          <w:rFonts w:ascii="Arial" w:hAnsi="Arial" w:cs="Arial"/>
+        </w:rPr>
+        <w:t xml:space="preserve"> </w:t>
+      </w:r>
+      <w:proofErr w:type="gramStart"/>
+      <w:r>
+        <w:rPr>
+          <w:rFonts w:ascii="Arial" w:hAnsi="Arial" w:cs="Arial"/>
+        </w:rPr>
+        <w:t>%}None</w:t>
+      </w:r>
+      <w:proofErr w:type="gramEnd"/>
+      <w:r>
+        <w:rPr>
+          <w:rFonts w:ascii="Arial" w:hAnsi="Arial" w:cs="Arial"/>
+        </w:rPr>
+        <w:t xml:space="preserve"> for </w:t>
+      </w:r>
+      <w:proofErr w:type="gramStart"/>
+      <w:r>
+        <w:rPr>
+          <w:rFonts w:ascii="Arial" w:hAnsi="Arial" w:cs="Arial"/>
+        </w:rPr>
+        <w:t>{{ child</w:t>
+      </w:r>
+      <w:proofErr w:type="gramEnd"/>
+      <w:r>
+        <w:rPr>
+          <w:rFonts w:ascii="Arial" w:hAnsi="Arial" w:cs="Arial"/>
+        </w:rPr>
+        <w:t xml:space="preserve"> }}. The child moved to Michigan within the last six </w:t>
+      </w:r>
+      <w:proofErr w:type="gramStart"/>
+      <w:r>
+        <w:rPr>
+          <w:rFonts w:ascii="Arial" w:hAnsi="Arial" w:cs="Arial"/>
+        </w:rPr>
+        <w:t>months.{</w:t>
+      </w:r>
+      <w:proofErr w:type="gramEnd"/>
+      <w:r>
+        <w:rPr>
+          <w:rFonts w:ascii="Arial" w:hAnsi="Arial" w:cs="Arial"/>
+        </w:rPr>
+        <w:t xml:space="preserve">% </w:t>
+      </w:r>
+      <w:proofErr w:type="spellStart"/>
+      <w:r>
+        <w:rPr>
+          <w:rFonts w:ascii="Arial" w:hAnsi="Arial" w:cs="Arial"/>
+        </w:rPr>
+        <w:t>elif</w:t>
+      </w:r>
+      <w:proofErr w:type="spellEnd"/>
+      <w:r>
+        <w:rPr>
+          <w:rFonts w:ascii="Arial" w:hAnsi="Arial" w:cs="Arial"/>
+        </w:rPr>
+        <w:t xml:space="preserve"> </w:t>
+      </w:r>
+      <w:proofErr w:type="spellStart"/>
+      <w:proofErr w:type="gramStart"/>
+      <w:r>
+        <w:rPr>
+          <w:rFonts w:ascii="Arial" w:hAnsi="Arial" w:cs="Arial"/>
+        </w:rPr>
+        <w:t>child.home</w:t>
+      </w:r>
+      <w:proofErr w:type="gramEnd"/>
+      <w:r>
+        <w:rPr>
+          <w:rFonts w:ascii="Arial" w:hAnsi="Arial" w:cs="Arial"/>
+        </w:rPr>
+        <w:t>_state</w:t>
+      </w:r>
+      <w:proofErr w:type="spellEnd"/>
+      <w:r>
+        <w:rPr>
+          <w:rFonts w:ascii="Arial" w:hAnsi="Arial" w:cs="Arial"/>
+        </w:rPr>
+        <w:t xml:space="preserve"> == "none" and not </w:t>
+      </w:r>
+      <w:proofErr w:type="spellStart"/>
+      <w:r>
+        <w:rPr>
+          <w:rFonts w:ascii="Arial" w:hAnsi="Arial" w:cs="Arial"/>
+        </w:rPr>
+        <w:t>child.MI_jurisdiction</w:t>
+      </w:r>
+      <w:proofErr w:type="spellEnd"/>
+      <w:r>
+        <w:rPr>
+          <w:rFonts w:ascii="Arial" w:hAnsi="Arial" w:cs="Arial"/>
+        </w:rPr>
+        <w:t xml:space="preserve"> </w:t>
+      </w:r>
+      <w:proofErr w:type="gramStart"/>
+      <w:r>
+        <w:rPr>
+          <w:rFonts w:ascii="Arial" w:hAnsi="Arial" w:cs="Arial"/>
+        </w:rPr>
+        <w:t>%}None</w:t>
+      </w:r>
+      <w:proofErr w:type="gramEnd"/>
+      <w:r>
+        <w:rPr>
+          <w:rFonts w:ascii="Arial" w:hAnsi="Arial" w:cs="Arial"/>
+        </w:rPr>
+        <w:t xml:space="preserve"> for </w:t>
+      </w:r>
+      <w:proofErr w:type="gramStart"/>
+      <w:r>
+        <w:rPr>
+          <w:rFonts w:ascii="Arial" w:hAnsi="Arial" w:cs="Arial"/>
+        </w:rPr>
+        <w:t>{{ child</w:t>
+      </w:r>
+      <w:proofErr w:type="gramEnd"/>
+      <w:r>
+        <w:rPr>
+          <w:rFonts w:ascii="Arial" w:hAnsi="Arial" w:cs="Arial"/>
+        </w:rPr>
+        <w:t xml:space="preserve"> }}.{% else %}{{ </w:t>
+      </w:r>
+      <w:proofErr w:type="spellStart"/>
+      <w:r>
+        <w:rPr>
+          <w:rFonts w:ascii="Arial" w:hAnsi="Arial" w:cs="Arial"/>
+        </w:rPr>
+        <w:t>child.home_state</w:t>
+      </w:r>
+      <w:proofErr w:type="spellEnd"/>
+      <w:r>
+        <w:rPr>
+          <w:rFonts w:ascii="Arial" w:hAnsi="Arial" w:cs="Arial"/>
+        </w:rPr>
+        <w:t xml:space="preserve"> }} for {{ child }}</w:t>
+      </w:r>
+      <w:r>
+        <w:rPr>
+          <w:rFonts w:ascii="Arial" w:hAnsi="Arial" w:cs="Arial"/>
+        </w:rPr>
+        <w:t>.</w:t>
       </w:r>
       <w:r>
         <w:rPr>
@@ -1007,7 +2545,23 @@
           <w:rFonts w:ascii="Arial" w:hAnsi="Arial" w:cs="Arial"/>
           <w:highlight w:val="magenta"/>
         </w:rPr>
-        <w:t>{%p endfor %}</w:t>
+        <w:t xml:space="preserve">{%p </w:t>
+      </w:r>
+      <w:proofErr w:type="spellStart"/>
+      <w:r>
+        <w:rPr>
+          <w:rFonts w:ascii="Arial" w:hAnsi="Arial" w:cs="Arial"/>
+          <w:highlight w:val="magenta"/>
+        </w:rPr>
+        <w:t>endfor</w:t>
+      </w:r>
+      <w:proofErr w:type="spellEnd"/>
+      <w:r>
+        <w:rPr>
+          <w:rFonts w:ascii="Arial" w:hAnsi="Arial" w:cs="Arial"/>
+          <w:highlight w:val="magenta"/>
+        </w:rPr>
+        <w:t xml:space="preserve"> %}</w:t>
       </w:r>
     </w:p>
     <w:p>
@@ -1245,6 +2799,7 @@
             </w:rPr>
             <w:t xml:space="preserve"> </w:t>
           </w:r>
+          <w:proofErr w:type="gramStart"/>
           <w:r>
             <w:rPr>
               <w:b/>
@@ -1252,7 +2807,37 @@
               <w:sz w:val="16"/>
               <w:szCs w:val="16"/>
             </w:rPr>
-            <w:t>{{ docket_number }}</w:t>
+            <w:t xml:space="preserve">{{ </w:t>
+          </w:r>
+          <w:proofErr w:type="spellStart"/>
+          <w:r>
+            <w:rPr>
+              <w:b/>
+              <w:color w:val="231F20"/>
+              <w:sz w:val="16"/>
+              <w:szCs w:val="16"/>
+            </w:rPr>
+            <w:t>docket</w:t>
+          </w:r>
+          <w:proofErr w:type="gramEnd"/>
+          <w:r>
+            <w:rPr>
+              <w:b/>
+              <w:color w:val="231F20"/>
+              <w:sz w:val="16"/>
+              <w:szCs w:val="16"/>
+            </w:rPr>
+            <w:t>_number</w:t>
+          </w:r>
+          <w:proofErr w:type="spellEnd"/>
+          <w:r>
+            <w:rPr>
+              <w:b/>
+              <w:color w:val="231F20"/>
+              <w:sz w:val="16"/>
+              <w:szCs w:val="16"/>
+            </w:rPr>
+            <w:t xml:space="preserve"> }}</w:t>
           </w:r>
         </w:p>
       </w:tc>
@@ -1355,6 +2940,7 @@
               <w:szCs w:val="20"/>
             </w:rPr>
           </w:pPr>
+          <w:proofErr w:type="gramStart"/>
           <w:r>
             <w:rPr>
               <w:b/>
@@ -1365,6 +2951,7 @@
             </w:rPr>
             <w:t xml:space="preserve">{{ </w:t>
           </w:r>
+          <w:proofErr w:type="spellStart"/>
           <w:r>
             <w:rPr>
               <w:b/>
@@ -1372,8 +2959,30 @@
               <w:sz w:val="20"/>
               <w:szCs w:val="20"/>
             </w:rPr>
-            <w:t>the_court.number</w:t>
+            <w:t>the</w:t>
           </w:r>
+          <w:proofErr w:type="gramEnd"/>
+          <w:r>
+            <w:rPr>
+              <w:b/>
+              <w:bCs/>
+              <w:sz w:val="20"/>
+              <w:szCs w:val="20"/>
+            </w:rPr>
+            <w:t>_</w:t>
+          </w:r>
+          <w:proofErr w:type="gramStart"/>
+          <w:r>
+            <w:rPr>
+              <w:b/>
+              <w:bCs/>
+              <w:sz w:val="20"/>
+              <w:szCs w:val="20"/>
+            </w:rPr>
+            <w:t>court.number</w:t>
+          </w:r>
+          <w:proofErr w:type="spellEnd"/>
+          <w:proofErr w:type="gramEnd"/>
           <w:r>
             <w:rPr>
               <w:b/>
@@ -1405,6 +3014,7 @@
               <w:szCs w:val="20"/>
             </w:rPr>
           </w:pPr>
+          <w:proofErr w:type="gramStart"/>
           <w:r>
             <w:rPr>
               <w:b/>
@@ -1415,6 +3025,7 @@
             </w:rPr>
             <w:t xml:space="preserve">{{ </w:t>
           </w:r>
+          <w:proofErr w:type="spellStart"/>
           <w:r>
             <w:rPr>
               <w:b/>
@@ -1422,7 +3033,48 @@
               <w:sz w:val="20"/>
               <w:szCs w:val="20"/>
             </w:rPr>
-            <w:t>county_choice.upper()</w:t>
+            <w:t>county</w:t>
+          </w:r>
+          <w:proofErr w:type="gramEnd"/>
+          <w:r>
+            <w:rPr>
+              <w:b/>
+              <w:bCs/>
+              <w:sz w:val="20"/>
+              <w:szCs w:val="20"/>
+            </w:rPr>
+            <w:t>_</w:t>
+          </w:r>
+          <w:proofErr w:type="gramStart"/>
+          <w:r>
+            <w:rPr>
+              <w:b/>
+              <w:bCs/>
+              <w:sz w:val="20"/>
+              <w:szCs w:val="20"/>
+            </w:rPr>
+            <w:t>choice.upper</w:t>
+          </w:r>
+          <w:proofErr w:type="spellEnd"/>
+          <w:proofErr w:type="gramEnd"/>
+          <w:r>
+            <w:rPr>
+              <w:b/>
+              <w:bCs/>
+              <w:sz w:val="20"/>
+              <w:szCs w:val="20"/>
+            </w:rPr>
+            <w:t>(</w:t>
+          </w:r>
+          <w:proofErr w:type="gramStart"/>
+          <w:r>
+            <w:rPr>
+              <w:b/>
+              <w:bCs/>
+              <w:sz w:val="20"/>
+              <w:szCs w:val="20"/>
+            </w:rPr>
+            <w:t>)</w:t>
           </w:r>
           <w:r>
             <w:rPr>
@@ -1432,7 +3084,18 @@
               <w:sz w:val="20"/>
               <w:szCs w:val="20"/>
             </w:rPr>
-            <w:t xml:space="preserve"> }} </w:t>
+            <w:t xml:space="preserve"> }</w:t>
+          </w:r>
+          <w:proofErr w:type="gramEnd"/>
+          <w:r>
+            <w:rPr>
+              <w:b/>
+              <w:bCs/>
+              <w:caps/>
+              <w:sz w:val="20"/>
+              <w:szCs w:val="20"/>
+            </w:rPr>
+            <w:t xml:space="preserve">} </w:t>
           </w:r>
           <w:r>
             <w:rPr>
@@ -1564,12 +3227,37 @@
               <w:szCs w:val="20"/>
             </w:rPr>
           </w:pPr>
+          <w:proofErr w:type="gramStart"/>
           <w:r>
             <w:rPr>
               <w:sz w:val="20"/>
               <w:szCs w:val="20"/>
             </w:rPr>
-            <w:t>{{ docket_number }}</w:t>
+            <w:t xml:space="preserve">{{ </w:t>
+          </w:r>
+          <w:proofErr w:type="spellStart"/>
+          <w:r>
+            <w:rPr>
+              <w:sz w:val="20"/>
+              <w:szCs w:val="20"/>
+            </w:rPr>
+            <w:t>docket</w:t>
+          </w:r>
+          <w:proofErr w:type="gramEnd"/>
+          <w:r>
+            <w:rPr>
+              <w:sz w:val="20"/>
+              <w:szCs w:val="20"/>
+            </w:rPr>
+            <w:t>_number</w:t>
+          </w:r>
+          <w:proofErr w:type="spellEnd"/>
+          <w:r>
+            <w:rPr>
+              <w:sz w:val="20"/>
+              <w:szCs w:val="20"/>
+            </w:rPr>
+            <w:t xml:space="preserve"> }}</w:t>
           </w:r>
         </w:p>
       </w:tc>
@@ -1794,7 +3482,7 @@
   <w:abstractNum w:abstractNumId="2" w15:restartNumberingAfterBreak="0">
     <w:nsid w:val="4A574198"/>
     <w:multiLevelType w:val="hybridMultilevel"/>
-    <w:tmpl w:val="4C409356"/>
+    <w:tmpl w:val="59CA05B8"/>
     <w:lvl w:ilvl="0" w:tplc="04090001">
       <w:start w:val="1"/>
       <w:numFmt w:val="bullet"/>

</xml_diff>

<commit_message>
Removed child age boundary for recent move to MI and unnecessary code from block
</commit_message>
<xml_diff>
--- a/docassemble/MLHDivorceAndCustody/data/templates/UCCJEA_affidavit_mc416_addendum.docx
+++ b/docassemble/MLHDivorceAndCustody/data/templates/UCCJEA_affidavit_mc416_addendum.docx
@@ -2283,6 +2283,106 @@
         <w:rPr>
           <w:rFonts w:ascii="Arial" w:hAnsi="Arial" w:cs="Arial"/>
         </w:rPr>
+        <w:t>child.currently</w:t>
+      </w:r>
+      <w:proofErr w:type="gramEnd"/>
+      <w:r>
+        <w:rPr>
+          <w:rFonts w:ascii="Arial" w:hAnsi="Arial" w:cs="Arial"/>
+        </w:rPr>
+        <w:t>_resides_in_type</w:t>
+      </w:r>
+      <w:proofErr w:type="spellEnd"/>
+      <w:r>
+        <w:rPr>
+          <w:rFonts w:ascii="Arial" w:hAnsi="Arial" w:cs="Arial"/>
+        </w:rPr>
+        <w:t xml:space="preserve"> == "Michigan" and not </w:t>
+      </w:r>
+      <w:proofErr w:type="spellStart"/>
+      <w:proofErr w:type="gramStart"/>
+      <w:r>
+        <w:rPr>
+          <w:rFonts w:ascii="Arial" w:hAnsi="Arial" w:cs="Arial"/>
+        </w:rPr>
+        <w:t>child.current</w:t>
+      </w:r>
+      <w:proofErr w:type="gramEnd"/>
+      <w:r>
+        <w:rPr>
+          <w:rFonts w:ascii="Arial" w:hAnsi="Arial" w:cs="Arial"/>
+        </w:rPr>
+        <w:t>_residence_is_home_state</w:t>
+      </w:r>
+      <w:proofErr w:type="spellEnd"/>
+      <w:r>
+        <w:rPr>
+          <w:rFonts w:ascii="Arial" w:hAnsi="Arial" w:cs="Arial"/>
+        </w:rPr>
+        <w:t xml:space="preserve"> </w:t>
+      </w:r>
+      <w:proofErr w:type="gramStart"/>
+      <w:r>
+        <w:rPr>
+          <w:rFonts w:ascii="Arial" w:hAnsi="Arial" w:cs="Arial"/>
+        </w:rPr>
+        <w:t>%}None</w:t>
+      </w:r>
+      <w:proofErr w:type="gramEnd"/>
+      <w:r>
+        <w:rPr>
+          <w:rFonts w:ascii="Arial" w:hAnsi="Arial" w:cs="Arial"/>
+        </w:rPr>
+        <w:t xml:space="preserve"> for </w:t>
+      </w:r>
+      <w:proofErr w:type="gramStart"/>
+      <w:r>
+        <w:rPr>
+          <w:rFonts w:ascii="Arial" w:hAnsi="Arial" w:cs="Arial"/>
+        </w:rPr>
+        <w:t>{{ child</w:t>
+      </w:r>
+      <w:proofErr w:type="gramEnd"/>
+      <w:r>
+        <w:rPr>
+          <w:rFonts w:ascii="Arial" w:hAnsi="Arial" w:cs="Arial"/>
+        </w:rPr>
+        <w:t xml:space="preserve"> }}. The child moved to Michigan within the last six </w:t>
+      </w:r>
+      <w:proofErr w:type="gramStart"/>
+      <w:r>
+        <w:rPr>
+          <w:rFonts w:ascii="Arial" w:hAnsi="Arial" w:cs="Arial"/>
+        </w:rPr>
+        <w:t>months.{</w:t>
+      </w:r>
+      <w:proofErr w:type="gramEnd"/>
+      <w:r>
+        <w:rPr>
+          <w:rFonts w:ascii="Arial" w:hAnsi="Arial" w:cs="Arial"/>
+        </w:rPr>
+        <w:t xml:space="preserve">% </w:t>
+      </w:r>
+      <w:proofErr w:type="spellStart"/>
+      <w:r>
+        <w:rPr>
+          <w:rFonts w:ascii="Arial" w:hAnsi="Arial" w:cs="Arial"/>
+        </w:rPr>
+        <w:t>elif</w:t>
+      </w:r>
+      <w:proofErr w:type="spellEnd"/>
+      <w:r>
+        <w:rPr>
+          <w:rFonts w:ascii="Arial" w:hAnsi="Arial" w:cs="Arial"/>
+        </w:rPr>
+        <w:t xml:space="preserve"> </w:t>
+      </w:r>
+      <w:proofErr w:type="spellStart"/>
+      <w:proofErr w:type="gramStart"/>
+      <w:r>
+        <w:rPr>
+          <w:rFonts w:ascii="Arial" w:hAnsi="Arial" w:cs="Arial"/>
+        </w:rPr>
         <w:t>child.home</w:t>
       </w:r>
       <w:proofErr w:type="gramEnd"/>
@@ -2311,99 +2411,97 @@
         <w:rPr>
           <w:rFonts w:ascii="Arial" w:hAnsi="Arial" w:cs="Arial"/>
         </w:rPr>
-        <w:t xml:space="preserve"> and </w:t>
-      </w:r>
-      <w:proofErr w:type="spellStart"/>
+        <w:t xml:space="preserve"> </w:t>
+      </w:r>
       <w:proofErr w:type="gramStart"/>
       <w:r>
         <w:rPr>
           <w:rFonts w:ascii="Arial" w:hAnsi="Arial" w:cs="Arial"/>
         </w:rPr>
-        <w:t>child.currently</w:t>
+        <w:t>%}None</w:t>
       </w:r>
       <w:proofErr w:type="gramEnd"/>
       <w:r>
         <w:rPr>
           <w:rFonts w:ascii="Arial" w:hAnsi="Arial" w:cs="Arial"/>
         </w:rPr>
-        <w:t>_resides_in_type</w:t>
-      </w:r>
-      <w:proofErr w:type="spellEnd"/>
-      <w:r>
-        <w:rPr>
-          <w:rFonts w:ascii="Arial" w:hAnsi="Arial" w:cs="Arial"/>
-        </w:rPr>
-        <w:t xml:space="preserve"> == "Michigan" and </w:t>
-      </w:r>
-      <w:proofErr w:type="spellStart"/>
-      <w:r>
-        <w:rPr>
-          <w:rFonts w:ascii="Arial" w:hAnsi="Arial" w:cs="Arial"/>
-        </w:rPr>
-        <w:t>child.age_in_</w:t>
+        <w:t xml:space="preserve"> for </w:t>
       </w:r>
       <w:proofErr w:type="gramStart"/>
       <w:r>
         <w:rPr>
           <w:rFonts w:ascii="Arial" w:hAnsi="Arial" w:cs="Arial"/>
         </w:rPr>
-        <w:t>months</w:t>
-      </w:r>
-      <w:proofErr w:type="spellEnd"/>
-      <w:r>
-        <w:rPr>
-          <w:rFonts w:ascii="Arial" w:hAnsi="Arial" w:cs="Arial"/>
-        </w:rPr>
-        <w:t>(</w:t>
+        <w:t>{{ child</w:t>
       </w:r>
       <w:proofErr w:type="gramEnd"/>
       <w:r>
         <w:rPr>
           <w:rFonts w:ascii="Arial" w:hAnsi="Arial" w:cs="Arial"/>
         </w:rPr>
-        <w:t xml:space="preserve">) &gt;= 6 and not </w:t>
-      </w:r>
-      <w:proofErr w:type="spellStart"/>
+        <w:t xml:space="preserve"> }</w:t>
+      </w:r>
       <w:proofErr w:type="gramStart"/>
       <w:r>
         <w:rPr>
           <w:rFonts w:ascii="Arial" w:hAnsi="Arial" w:cs="Arial"/>
         </w:rPr>
-        <w:t>child.current</w:t>
+        <w:t>}.{</w:t>
       </w:r>
       <w:proofErr w:type="gramEnd"/>
       <w:r>
         <w:rPr>
           <w:rFonts w:ascii="Arial" w:hAnsi="Arial" w:cs="Arial"/>
         </w:rPr>
-        <w:t>_residence_is_home_state</w:t>
-      </w:r>
-      <w:proofErr w:type="spellEnd"/>
-      <w:r>
-        <w:rPr>
-          <w:rFonts w:ascii="Arial" w:hAnsi="Arial" w:cs="Arial"/>
-        </w:rPr>
-        <w:t xml:space="preserve"> </w:t>
+        <w:t xml:space="preserve">% else </w:t>
       </w:r>
       <w:proofErr w:type="gramStart"/>
       <w:r>
         <w:rPr>
           <w:rFonts w:ascii="Arial" w:hAnsi="Arial" w:cs="Arial"/>
         </w:rPr>
-        <w:t>%}None</w:t>
+        <w:t xml:space="preserve">%}{{ </w:t>
+      </w:r>
+      <w:proofErr w:type="spellStart"/>
+      <w:r>
+        <w:rPr>
+          <w:rFonts w:ascii="Arial" w:hAnsi="Arial" w:cs="Arial"/>
+        </w:rPr>
+        <w:t>child</w:t>
       </w:r>
       <w:proofErr w:type="gramEnd"/>
       <w:r>
         <w:rPr>
           <w:rFonts w:ascii="Arial" w:hAnsi="Arial" w:cs="Arial"/>
         </w:rPr>
-        <w:t xml:space="preserve"> for </w:t>
+        <w:t>.home_</w:t>
       </w:r>
       <w:proofErr w:type="gramStart"/>
       <w:r>
         <w:rPr>
           <w:rFonts w:ascii="Arial" w:hAnsi="Arial" w:cs="Arial"/>
         </w:rPr>
+        <w:t>state</w:t>
+      </w:r>
+      <w:proofErr w:type="spellEnd"/>
+      <w:r>
+        <w:rPr>
+          <w:rFonts w:ascii="Arial" w:hAnsi="Arial" w:cs="Arial"/>
+        </w:rPr>
+        <w:t xml:space="preserve"> }</w:t>
+      </w:r>
+      <w:proofErr w:type="gramEnd"/>
+      <w:r>
+        <w:rPr>
+          <w:rFonts w:ascii="Arial" w:hAnsi="Arial" w:cs="Arial"/>
+        </w:rPr>
+        <w:t xml:space="preserve">} for </w:t>
+      </w:r>
+      <w:proofErr w:type="gramStart"/>
+      <w:r>
+        <w:rPr>
+          <w:rFonts w:ascii="Arial" w:hAnsi="Arial" w:cs="Arial"/>
+        </w:rPr>
         <w:t>{{ child</w:t>
       </w:r>
       <w:proofErr w:type="gramEnd"/>
@@ -2411,125 +2509,33 @@
         <w:rPr>
           <w:rFonts w:ascii="Arial" w:hAnsi="Arial" w:cs="Arial"/>
         </w:rPr>
-        <w:t xml:space="preserve"> }}. The child moved to Michigan within the last six </w:t>
+        <w:t xml:space="preserve"> }</w:t>
       </w:r>
       <w:proofErr w:type="gramStart"/>
       <w:r>
         <w:rPr>
           <w:rFonts w:ascii="Arial" w:hAnsi="Arial" w:cs="Arial"/>
         </w:rPr>
-        <w:t>months.{</w:t>
+        <w:t>}</w:t>
+      </w:r>
+      <w:r>
+        <w:rPr>
+          <w:rFonts w:ascii="Arial" w:hAnsi="Arial" w:cs="Arial"/>
+        </w:rPr>
+        <w:t>.</w:t>
+      </w:r>
+      <w:r>
+        <w:rPr>
+          <w:rFonts w:ascii="Arial" w:hAnsi="Arial" w:cs="Arial"/>
+        </w:rPr>
+        <w:t>{</w:t>
       </w:r>
       <w:proofErr w:type="gramEnd"/>
       <w:r>
         <w:rPr>
           <w:rFonts w:ascii="Arial" w:hAnsi="Arial" w:cs="Arial"/>
         </w:rPr>
-        <w:t xml:space="preserve">% </w:t>
-      </w:r>
-      <w:proofErr w:type="spellStart"/>
-      <w:r>
-        <w:rPr>
-          <w:rFonts w:ascii="Arial" w:hAnsi="Arial" w:cs="Arial"/>
-        </w:rPr>
-        <w:t>elif</w:t>
-      </w:r>
-      <w:proofErr w:type="spellEnd"/>
-      <w:r>
-        <w:rPr>
-          <w:rFonts w:ascii="Arial" w:hAnsi="Arial" w:cs="Arial"/>
-        </w:rPr>
-        <w:t xml:space="preserve"> </w:t>
-      </w:r>
-      <w:proofErr w:type="spellStart"/>
-      <w:proofErr w:type="gramStart"/>
-      <w:r>
-        <w:rPr>
-          <w:rFonts w:ascii="Arial" w:hAnsi="Arial" w:cs="Arial"/>
-        </w:rPr>
-        <w:t>child.home</w:t>
-      </w:r>
-      <w:proofErr w:type="gramEnd"/>
-      <w:r>
-        <w:rPr>
-          <w:rFonts w:ascii="Arial" w:hAnsi="Arial" w:cs="Arial"/>
-        </w:rPr>
-        <w:t>_state</w:t>
-      </w:r>
-      <w:proofErr w:type="spellEnd"/>
-      <w:r>
-        <w:rPr>
-          <w:rFonts w:ascii="Arial" w:hAnsi="Arial" w:cs="Arial"/>
-        </w:rPr>
-        <w:t xml:space="preserve"> == "none" and not </w:t>
-      </w:r>
-      <w:proofErr w:type="spellStart"/>
-      <w:r>
-        <w:rPr>
-          <w:rFonts w:ascii="Arial" w:hAnsi="Arial" w:cs="Arial"/>
-        </w:rPr>
-        <w:t>child.MI_jurisdiction</w:t>
-      </w:r>
-      <w:proofErr w:type="spellEnd"/>
-      <w:r>
-        <w:rPr>
-          <w:rFonts w:ascii="Arial" w:hAnsi="Arial" w:cs="Arial"/>
-        </w:rPr>
-        <w:t xml:space="preserve"> </w:t>
-      </w:r>
-      <w:proofErr w:type="gramStart"/>
-      <w:r>
-        <w:rPr>
-          <w:rFonts w:ascii="Arial" w:hAnsi="Arial" w:cs="Arial"/>
-        </w:rPr>
-        <w:t>%}None</w:t>
-      </w:r>
-      <w:proofErr w:type="gramEnd"/>
-      <w:r>
-        <w:rPr>
-          <w:rFonts w:ascii="Arial" w:hAnsi="Arial" w:cs="Arial"/>
-        </w:rPr>
-        <w:t xml:space="preserve"> for </w:t>
-      </w:r>
-      <w:proofErr w:type="gramStart"/>
-      <w:r>
-        <w:rPr>
-          <w:rFonts w:ascii="Arial" w:hAnsi="Arial" w:cs="Arial"/>
-        </w:rPr>
-        <w:t>{{ child</w:t>
-      </w:r>
-      <w:proofErr w:type="gramEnd"/>
-      <w:r>
-        <w:rPr>
-          <w:rFonts w:ascii="Arial" w:hAnsi="Arial" w:cs="Arial"/>
-        </w:rPr>
-        <w:t xml:space="preserve"> }}.{% else %}{{ </w:t>
-      </w:r>
-      <w:proofErr w:type="spellStart"/>
-      <w:r>
-        <w:rPr>
-          <w:rFonts w:ascii="Arial" w:hAnsi="Arial" w:cs="Arial"/>
-        </w:rPr>
-        <w:t>child.home_state</w:t>
-      </w:r>
-      <w:proofErr w:type="spellEnd"/>
-      <w:r>
-        <w:rPr>
-          <w:rFonts w:ascii="Arial" w:hAnsi="Arial" w:cs="Arial"/>
-        </w:rPr>
-        <w:t xml:space="preserve"> }} for {{ child }}</w:t>
-      </w:r>
-      <w:r>
-        <w:rPr>
-          <w:rFonts w:ascii="Arial" w:hAnsi="Arial" w:cs="Arial"/>
-        </w:rPr>
-        <w:t>.</w:t>
-      </w:r>
-      <w:r>
-        <w:rPr>
-          <w:rFonts w:ascii="Arial" w:hAnsi="Arial" w:cs="Arial"/>
-        </w:rPr>
-        <w:t>{% endif %}</w:t>
+        <w:t>% endif %}</w:t>
       </w:r>
     </w:p>
     <w:p>

</xml_diff>

<commit_message>
update MC21, UCCJEA addendum; work on adding the screening elements
</commit_message>
<xml_diff>
--- a/docassemble/MLHDivorceAndCustody/data/templates/UCCJEA_affidavit_mc416_addendum.docx
+++ b/docassemble/MLHDivorceAndCustody/data/templates/UCCJEA_affidavit_mc416_addendum.docx
@@ -406,6 +406,7 @@
         </w:rPr>
         <w:t xml:space="preserve">(add_to_MC416_4=True) | length &gt; </w:t>
       </w:r>
+      <w:proofErr w:type="gramStart"/>
       <w:r>
         <w:rPr>
           <w:rFonts w:ascii="Arial" w:hAnsi="Arial" w:cs="Arial"/>
@@ -424,6 +425,7 @@
         </w:rPr>
         <w:t>%}</w:t>
       </w:r>
+      <w:proofErr w:type="gramEnd"/>
     </w:p>
     <w:p>
       <w:pPr>
@@ -573,6 +575,26 @@
         </w:rPr>
         <w:t xml:space="preserve"> if </w:t>
       </w:r>
+      <w:r>
+        <w:rPr>
+          <w:rFonts w:ascii="Arial" w:hAnsi="Arial" w:cs="Arial"/>
+        </w:rPr>
+        <w:t>(</w:t>
+      </w:r>
+      <w:proofErr w:type="spellStart"/>
+      <w:r>
+        <w:rPr>
+          <w:rFonts w:ascii="Arial" w:hAnsi="Arial" w:cs="Arial"/>
+        </w:rPr>
+        <w:t>case.country</w:t>
+      </w:r>
+      <w:proofErr w:type="spellEnd"/>
+      <w:r>
+        <w:rPr>
+          <w:rFonts w:ascii="Arial" w:hAnsi="Arial" w:cs="Arial"/>
+        </w:rPr>
+        <w:t xml:space="preserve"> != "US" or </w:t>
+      </w:r>
       <w:proofErr w:type="spellStart"/>
       <w:r>
         <w:rPr>
@@ -585,7 +607,33 @@
         <w:rPr>
           <w:rFonts w:ascii="Arial" w:hAnsi="Arial" w:cs="Arial"/>
         </w:rPr>
-        <w:t xml:space="preserve"> != "MI" else court_list.get_court_info_by_2([</w:t>
+        <w:t xml:space="preserve"> != "MI" or </w:t>
+      </w:r>
+      <w:proofErr w:type="spellStart"/>
+      <w:r>
+        <w:rPr>
+          <w:rFonts w:ascii="Arial" w:hAnsi="Arial" w:cs="Arial"/>
+        </w:rPr>
+        <w:t>case.in_tribal_court</w:t>
+      </w:r>
+      <w:proofErr w:type="spellEnd"/>
+      <w:r>
+        <w:rPr>
+          <w:rFonts w:ascii="Arial" w:hAnsi="Arial" w:cs="Arial"/>
+        </w:rPr>
+        <w:t>)</w:t>
+      </w:r>
+      <w:r>
+        <w:rPr>
+          <w:rFonts w:ascii="Arial" w:hAnsi="Arial" w:cs="Arial"/>
+        </w:rPr>
+        <w:t xml:space="preserve"> </w:t>
+      </w:r>
+      <w:r>
+        <w:rPr>
+          <w:rFonts w:ascii="Arial" w:hAnsi="Arial" w:cs="Arial"/>
+        </w:rPr>
+        <w:t>else court_list.get_court_info_by_2([</w:t>
       </w:r>
       <w:proofErr w:type="spellStart"/>
       <w:r>
@@ -627,7 +675,115 @@
         <w:rPr>
           <w:rFonts w:ascii="Arial" w:hAnsi="Arial" w:cs="Arial"/>
         </w:rPr>
-        <w:t xml:space="preserve">='name') }}; {{ </w:t>
+        <w:t xml:space="preserve">='name') }}; </w:t>
+      </w:r>
+      <w:r>
+        <w:rPr>
+          <w:rFonts w:ascii="Arial" w:hAnsi="Arial" w:cs="Arial"/>
+        </w:rPr>
+        <w:t xml:space="preserve">{% if </w:t>
+      </w:r>
+      <w:proofErr w:type="spellStart"/>
+      <w:r>
+        <w:rPr>
+          <w:rFonts w:ascii="Arial" w:hAnsi="Arial" w:cs="Arial"/>
+        </w:rPr>
+        <w:t>case.country</w:t>
+      </w:r>
+      <w:proofErr w:type="spellEnd"/>
+      <w:r>
+        <w:rPr>
+          <w:rFonts w:ascii="Arial" w:hAnsi="Arial" w:cs="Arial"/>
+        </w:rPr>
+        <w:t xml:space="preserve"> == "US"</w:t>
+      </w:r>
+      <w:r>
+        <w:rPr>
+          <w:rFonts w:ascii="Arial" w:hAnsi="Arial" w:cs="Arial"/>
+        </w:rPr>
+        <w:t xml:space="preserve"> </w:t>
+      </w:r>
+      <w:r>
+        <w:rPr>
+          <w:rFonts w:ascii="Arial" w:hAnsi="Arial" w:cs="Arial"/>
+        </w:rPr>
+        <w:t>%}</w:t>
+      </w:r>
+      <w:r>
+        <w:rPr>
+          <w:rFonts w:ascii="Arial" w:hAnsi="Arial" w:cs="Arial"/>
+        </w:rPr>
+        <w:t xml:space="preserve">{% if </w:t>
+      </w:r>
+      <w:proofErr w:type="spellStart"/>
+      <w:r>
+        <w:rPr>
+          <w:rFonts w:ascii="Arial" w:hAnsi="Arial" w:cs="Arial"/>
+        </w:rPr>
+        <w:t>case.</w:t>
+      </w:r>
+      <w:r>
+        <w:rPr>
+          <w:rFonts w:ascii="Arial" w:hAnsi="Arial" w:cs="Arial"/>
+        </w:rPr>
+        <w:t>state</w:t>
+      </w:r>
+      <w:proofErr w:type="spellEnd"/>
+      <w:r>
+        <w:rPr>
+          <w:rFonts w:ascii="Arial" w:hAnsi="Arial" w:cs="Arial"/>
+        </w:rPr>
+        <w:t xml:space="preserve"> == "</w:t>
+      </w:r>
+      <w:r>
+        <w:rPr>
+          <w:rFonts w:ascii="Arial" w:hAnsi="Arial" w:cs="Arial"/>
+        </w:rPr>
+        <w:t>MI</w:t>
+      </w:r>
+      <w:r>
+        <w:rPr>
+          <w:rFonts w:ascii="Arial" w:hAnsi="Arial" w:cs="Arial"/>
+        </w:rPr>
+        <w:t xml:space="preserve">" </w:t>
+      </w:r>
+      <w:r>
+        <w:rPr>
+          <w:rFonts w:ascii="Arial" w:hAnsi="Arial" w:cs="Arial"/>
+        </w:rPr>
+        <w:t>%}</w:t>
+      </w:r>
+      <w:r>
+        <w:rPr>
+          <w:rFonts w:ascii="Arial" w:hAnsi="Arial" w:cs="Arial"/>
+        </w:rPr>
+        <w:t xml:space="preserve">{% if </w:t>
+      </w:r>
+      <w:proofErr w:type="spellStart"/>
+      <w:r>
+        <w:rPr>
+          <w:rFonts w:ascii="Arial" w:hAnsi="Arial" w:cs="Arial"/>
+        </w:rPr>
+        <w:t>case.in_tribal_court</w:t>
+      </w:r>
+      <w:proofErr w:type="spellEnd"/>
+      <w:r>
+        <w:rPr>
+          <w:rFonts w:ascii="Arial" w:hAnsi="Arial" w:cs="Arial"/>
+        </w:rPr>
+        <w:t xml:space="preserve"> </w:t>
+      </w:r>
+      <w:r>
+        <w:rPr>
+          <w:rFonts w:ascii="Arial" w:hAnsi="Arial" w:cs="Arial"/>
+        </w:rPr>
+        <w:t>%}</w:t>
+      </w:r>
+      <w:r>
+        <w:rPr>
+          <w:rFonts w:ascii="Arial" w:hAnsi="Arial" w:cs="Arial"/>
+        </w:rPr>
+        <w:t xml:space="preserve">{{ </w:t>
       </w:r>
       <w:proofErr w:type="spellStart"/>
       <w:r>
@@ -641,21 +797,25 @@
         <w:rPr>
           <w:rFonts w:ascii="Arial" w:hAnsi="Arial" w:cs="Arial"/>
         </w:rPr>
-        <w:t xml:space="preserve"> if </w:t>
-      </w:r>
-      <w:proofErr w:type="spellStart"/>
-      <w:r>
-        <w:rPr>
-          <w:rFonts w:ascii="Arial" w:hAnsi="Arial" w:cs="Arial"/>
-        </w:rPr>
-        <w:t>case.state</w:t>
-      </w:r>
-      <w:proofErr w:type="spellEnd"/>
-      <w:r>
-        <w:rPr>
-          <w:rFonts w:ascii="Arial" w:hAnsi="Arial" w:cs="Arial"/>
-        </w:rPr>
-        <w:t xml:space="preserve"> != "MI" else court_list.get_court_info_by_2([</w:t>
+        <w:t xml:space="preserve"> }}</w:t>
+      </w:r>
+      <w:r>
+        <w:rPr>
+          <w:rFonts w:ascii="Arial" w:hAnsi="Arial" w:cs="Arial"/>
+        </w:rPr>
+        <w:t>;</w:t>
+      </w:r>
+      <w:r>
+        <w:rPr>
+          <w:rFonts w:ascii="Arial" w:hAnsi="Arial" w:cs="Arial"/>
+        </w:rPr>
+        <w:t>{% else %}</w:t>
+      </w:r>
+      <w:r>
+        <w:rPr>
+          <w:rFonts w:ascii="Arial" w:hAnsi="Arial" w:cs="Arial"/>
+        </w:rPr>
+        <w:t>{{ court_list.get_court_info_by_2([</w:t>
       </w:r>
       <w:proofErr w:type="spellStart"/>
       <w:r>
@@ -809,7 +969,247 @@
         <w:rPr>
           <w:rFonts w:ascii="Arial" w:hAnsi="Arial" w:cs="Arial"/>
         </w:rPr>
-        <w:t xml:space="preserve">='CSZ') }}; </w:t>
+        <w:t>='CSZ') }};</w:t>
+      </w:r>
+      <w:r>
+        <w:rPr>
+          <w:rFonts w:ascii="Arial" w:hAnsi="Arial" w:cs="Arial"/>
+        </w:rPr>
+        <w:t xml:space="preserve">{% </w:t>
+      </w:r>
+      <w:r>
+        <w:rPr>
+          <w:rFonts w:ascii="Arial" w:hAnsi="Arial" w:cs="Arial"/>
+        </w:rPr>
+        <w:t>endif</w:t>
+      </w:r>
+      <w:r>
+        <w:rPr>
+          <w:rFonts w:ascii="Arial" w:hAnsi="Arial" w:cs="Arial"/>
+        </w:rPr>
+        <w:t xml:space="preserve"> %}</w:t>
+      </w:r>
+      <w:r>
+        <w:rPr>
+          <w:rFonts w:ascii="Arial" w:hAnsi="Arial" w:cs="Arial"/>
+        </w:rPr>
+        <w:t xml:space="preserve">{% </w:t>
+      </w:r>
+      <w:proofErr w:type="spellStart"/>
+      <w:r>
+        <w:rPr>
+          <w:rFonts w:ascii="Arial" w:hAnsi="Arial" w:cs="Arial"/>
+        </w:rPr>
+        <w:t>elif</w:t>
+      </w:r>
+      <w:proofErr w:type="spellEnd"/>
+      <w:r>
+        <w:rPr>
+          <w:rFonts w:ascii="Arial" w:hAnsi="Arial" w:cs="Arial"/>
+        </w:rPr>
+        <w:t xml:space="preserve"> </w:t>
+      </w:r>
+      <w:proofErr w:type="spellStart"/>
+      <w:r>
+        <w:rPr>
+          <w:rFonts w:ascii="Arial" w:hAnsi="Arial" w:cs="Arial"/>
+        </w:rPr>
+        <w:t>case.</w:t>
+      </w:r>
+      <w:r>
+        <w:rPr>
+          <w:rFonts w:ascii="Arial" w:hAnsi="Arial" w:cs="Arial"/>
+        </w:rPr>
+        <w:t>state</w:t>
+      </w:r>
+      <w:proofErr w:type="spellEnd"/>
+      <w:r>
+        <w:rPr>
+          <w:rFonts w:ascii="Arial" w:hAnsi="Arial" w:cs="Arial"/>
+        </w:rPr>
+        <w:t xml:space="preserve"> </w:t>
+      </w:r>
+      <w:r>
+        <w:rPr>
+          <w:rFonts w:ascii="Arial" w:hAnsi="Arial" w:cs="Arial"/>
+        </w:rPr>
+        <w:t>!</w:t>
+      </w:r>
+      <w:r>
+        <w:rPr>
+          <w:rFonts w:ascii="Arial" w:hAnsi="Arial" w:cs="Arial"/>
+        </w:rPr>
+        <w:t>= "</w:t>
+      </w:r>
+      <w:r>
+        <w:rPr>
+          <w:rFonts w:ascii="Arial" w:hAnsi="Arial" w:cs="Arial"/>
+        </w:rPr>
+        <w:t>MI</w:t>
+      </w:r>
+      <w:r>
+        <w:rPr>
+          <w:rFonts w:ascii="Arial" w:hAnsi="Arial" w:cs="Arial"/>
+        </w:rPr>
+        <w:t xml:space="preserve">" </w:t>
+      </w:r>
+      <w:r>
+        <w:rPr>
+          <w:rFonts w:ascii="Arial" w:hAnsi="Arial" w:cs="Arial"/>
+        </w:rPr>
+        <w:t xml:space="preserve"> %}</w:t>
+      </w:r>
+      <w:r>
+        <w:rPr>
+          <w:rFonts w:ascii="Arial" w:hAnsi="Arial" w:cs="Arial"/>
+        </w:rPr>
+        <w:t xml:space="preserve">{{ </w:t>
+      </w:r>
+      <w:proofErr w:type="spellStart"/>
+      <w:r>
+        <w:rPr>
+          <w:rFonts w:ascii="Arial" w:hAnsi="Arial" w:cs="Arial"/>
+        </w:rPr>
+        <w:t>case.address</w:t>
+      </w:r>
+      <w:proofErr w:type="spellEnd"/>
+      <w:r>
+        <w:rPr>
+          <w:rFonts w:ascii="Arial" w:hAnsi="Arial" w:cs="Arial"/>
+        </w:rPr>
+        <w:t xml:space="preserve"> }};{</w:t>
+      </w:r>
+      <w:r>
+        <w:rPr>
+          <w:rFonts w:ascii="Arial" w:hAnsi="Arial" w:cs="Arial"/>
+        </w:rPr>
+        <w:t xml:space="preserve">% endif %}{% </w:t>
+      </w:r>
+      <w:proofErr w:type="spellStart"/>
+      <w:r>
+        <w:rPr>
+          <w:rFonts w:ascii="Arial" w:hAnsi="Arial" w:cs="Arial"/>
+        </w:rPr>
+        <w:t>elif</w:t>
+      </w:r>
+      <w:proofErr w:type="spellEnd"/>
+      <w:r>
+        <w:rPr>
+          <w:rFonts w:ascii="Arial" w:hAnsi="Arial" w:cs="Arial"/>
+        </w:rPr>
+        <w:t xml:space="preserve"> </w:t>
+      </w:r>
+      <w:proofErr w:type="spellStart"/>
+      <w:r>
+        <w:rPr>
+          <w:rFonts w:ascii="Arial" w:hAnsi="Arial" w:cs="Arial"/>
+        </w:rPr>
+        <w:t>case.country</w:t>
+      </w:r>
+      <w:proofErr w:type="spellEnd"/>
+      <w:r>
+        <w:rPr>
+          <w:rFonts w:ascii="Arial" w:hAnsi="Arial" w:cs="Arial"/>
+        </w:rPr>
+        <w:t xml:space="preserve"> </w:t>
+      </w:r>
+      <w:r>
+        <w:rPr>
+          <w:rFonts w:ascii="Arial" w:hAnsi="Arial" w:cs="Arial"/>
+        </w:rPr>
+        <w:t>!</w:t>
+      </w:r>
+      <w:r>
+        <w:rPr>
+          <w:rFonts w:ascii="Arial" w:hAnsi="Arial" w:cs="Arial"/>
+        </w:rPr>
+        <w:t>= "US"</w:t>
+      </w:r>
+      <w:r>
+        <w:rPr>
+          <w:rFonts w:ascii="Arial" w:hAnsi="Arial" w:cs="Arial"/>
+        </w:rPr>
+        <w:t xml:space="preserve"> %}</w:t>
+      </w:r>
+      <w:r>
+        <w:rPr>
+          <w:rFonts w:ascii="Arial" w:hAnsi="Arial" w:cs="Arial"/>
+        </w:rPr>
+        <w:t xml:space="preserve">{{ </w:t>
+      </w:r>
+      <w:proofErr w:type="spellStart"/>
+      <w:r>
+        <w:rPr>
+          <w:rFonts w:ascii="Arial" w:hAnsi="Arial" w:cs="Arial"/>
+        </w:rPr>
+        <w:t>case.address</w:t>
+      </w:r>
+      <w:proofErr w:type="spellEnd"/>
+      <w:r>
+        <w:rPr>
+          <w:rFonts w:ascii="Arial" w:hAnsi="Arial" w:cs="Arial"/>
+        </w:rPr>
+        <w:t xml:space="preserve"> }}, {{ </w:t>
+      </w:r>
+      <w:proofErr w:type="spellStart"/>
+      <w:r>
+        <w:rPr>
+          <w:rFonts w:ascii="Arial" w:hAnsi="Arial" w:cs="Arial"/>
+        </w:rPr>
+        <w:t>case.foreign_admin_unit</w:t>
+      </w:r>
+      <w:proofErr w:type="spellEnd"/>
+      <w:r>
+        <w:rPr>
+          <w:rFonts w:ascii="Arial" w:hAnsi="Arial" w:cs="Arial"/>
+        </w:rPr>
+        <w:t xml:space="preserve"> </w:t>
+      </w:r>
+      <w:r>
+        <w:rPr>
+          <w:rFonts w:ascii="Arial" w:hAnsi="Arial" w:cs="Arial"/>
+        </w:rPr>
+        <w:t>}</w:t>
+      </w:r>
+      <w:r>
+        <w:rPr>
+          <w:rFonts w:ascii="Arial" w:hAnsi="Arial" w:cs="Arial"/>
+        </w:rPr>
+        <w:t>}, {{</w:t>
+      </w:r>
+      <w:r>
+        <w:rPr>
+          <w:rFonts w:ascii="Arial" w:hAnsi="Arial" w:cs="Arial"/>
+        </w:rPr>
+        <w:t xml:space="preserve"> </w:t>
+      </w:r>
+      <w:proofErr w:type="spellStart"/>
+      <w:r>
+        <w:rPr>
+          <w:rFonts w:ascii="Arial" w:hAnsi="Arial" w:cs="Arial"/>
+        </w:rPr>
+        <w:t>country_name</w:t>
+      </w:r>
+      <w:proofErr w:type="spellEnd"/>
+      <w:r>
+        <w:rPr>
+          <w:rFonts w:ascii="Arial" w:hAnsi="Arial" w:cs="Arial"/>
+        </w:rPr>
+        <w:t>(</w:t>
+      </w:r>
+      <w:proofErr w:type="spellStart"/>
+      <w:r>
+        <w:rPr>
+          <w:rFonts w:ascii="Arial" w:hAnsi="Arial" w:cs="Arial"/>
+        </w:rPr>
+        <w:t>case.country</w:t>
+      </w:r>
+      <w:proofErr w:type="spellEnd"/>
+      <w:r>
+        <w:rPr>
+          <w:rFonts w:ascii="Arial" w:hAnsi="Arial" w:cs="Arial"/>
+        </w:rPr>
+        <w:t xml:space="preserve">) }};{% endif %} </w:t>
       </w:r>
       <w:r>
         <w:rPr>
@@ -1170,6 +1570,7 @@
         </w:rPr>
         <w:t xml:space="preserve"> | length &gt; </w:t>
       </w:r>
+      <w:proofErr w:type="gramStart"/>
       <w:r>
         <w:rPr>
           <w:rFonts w:ascii="Arial" w:hAnsi="Arial" w:cs="Arial"/>
@@ -1182,6 +1583,7 @@
         </w:rPr>
         <w:t xml:space="preserve"> %}</w:t>
       </w:r>
+      <w:proofErr w:type="gramEnd"/>
     </w:p>
     <w:p>
       <w:pPr>
@@ -1372,8 +1774,16 @@
         <w:rPr>
           <w:rFonts w:ascii="Arial" w:hAnsi="Arial" w:cs="Arial"/>
         </w:rPr>
-        <w:t xml:space="preserve"> in ["pending", "stayed"] %}</w:t>
-      </w:r>
+        <w:t xml:space="preserve"> in ["pending", "stayed"</w:t>
+      </w:r>
+      <w:proofErr w:type="gramStart"/>
+      <w:r>
+        <w:rPr>
+          <w:rFonts w:ascii="Arial" w:hAnsi="Arial" w:cs="Arial"/>
+        </w:rPr>
+        <w:t>] %}</w:t>
+      </w:r>
+      <w:proofErr w:type="gramEnd"/>
     </w:p>
     <w:p>
       <w:pPr>
@@ -1387,6 +1797,7 @@
         <w:rPr>
           <w:rFonts w:ascii="Arial" w:hAnsi="Arial" w:cs="Arial"/>
         </w:rPr>
+        <w:lastRenderedPageBreak/>
         <w:t xml:space="preserve">{{ </w:t>
       </w:r>
       <w:proofErr w:type="spellStart"/>
@@ -1415,7 +1826,13 @@
         <w:rPr>
           <w:rFonts w:ascii="Arial" w:hAnsi="Arial" w:cs="Arial"/>
         </w:rPr>
-        <w:t xml:space="preserve"> }}; {{ </w:t>
+        <w:t xml:space="preserve"> }}; </w:t>
+      </w:r>
+      <w:r>
+        <w:rPr>
+          <w:rFonts w:ascii="Arial" w:hAnsi="Arial" w:cs="Arial"/>
+        </w:rPr>
+        <w:t xml:space="preserve">{{ </w:t>
       </w:r>
       <w:proofErr w:type="spellStart"/>
       <w:r>
@@ -1431,6 +1848,26 @@
         </w:rPr>
         <w:t xml:space="preserve"> if </w:t>
       </w:r>
+      <w:r>
+        <w:rPr>
+          <w:rFonts w:ascii="Arial" w:hAnsi="Arial" w:cs="Arial"/>
+        </w:rPr>
+        <w:t>(</w:t>
+      </w:r>
+      <w:proofErr w:type="spellStart"/>
+      <w:r>
+        <w:rPr>
+          <w:rFonts w:ascii="Arial" w:hAnsi="Arial" w:cs="Arial"/>
+        </w:rPr>
+        <w:t>case.country</w:t>
+      </w:r>
+      <w:proofErr w:type="spellEnd"/>
+      <w:r>
+        <w:rPr>
+          <w:rFonts w:ascii="Arial" w:hAnsi="Arial" w:cs="Arial"/>
+        </w:rPr>
+        <w:t xml:space="preserve"> != "US" or </w:t>
+      </w:r>
       <w:proofErr w:type="spellStart"/>
       <w:r>
         <w:rPr>
@@ -1443,7 +1880,33 @@
         <w:rPr>
           <w:rFonts w:ascii="Arial" w:hAnsi="Arial" w:cs="Arial"/>
         </w:rPr>
-        <w:t xml:space="preserve"> != "MI" else court_list.get_court_info_by_2([</w:t>
+        <w:t xml:space="preserve"> != "MI" or </w:t>
+      </w:r>
+      <w:proofErr w:type="spellStart"/>
+      <w:r>
+        <w:rPr>
+          <w:rFonts w:ascii="Arial" w:hAnsi="Arial" w:cs="Arial"/>
+        </w:rPr>
+        <w:t>case.in_tribal_court</w:t>
+      </w:r>
+      <w:proofErr w:type="spellEnd"/>
+      <w:r>
+        <w:rPr>
+          <w:rFonts w:ascii="Arial" w:hAnsi="Arial" w:cs="Arial"/>
+        </w:rPr>
+        <w:t>)</w:t>
+      </w:r>
+      <w:r>
+        <w:rPr>
+          <w:rFonts w:ascii="Arial" w:hAnsi="Arial" w:cs="Arial"/>
+        </w:rPr>
+        <w:t xml:space="preserve"> </w:t>
+      </w:r>
+      <w:r>
+        <w:rPr>
+          <w:rFonts w:ascii="Arial" w:hAnsi="Arial" w:cs="Arial"/>
+        </w:rPr>
+        <w:t>else court_list.get_court_info_by_2([</w:t>
       </w:r>
       <w:proofErr w:type="spellStart"/>
       <w:r>
@@ -1485,7 +1948,97 @@
         <w:rPr>
           <w:rFonts w:ascii="Arial" w:hAnsi="Arial" w:cs="Arial"/>
         </w:rPr>
-        <w:t xml:space="preserve">='name') }}; {{ </w:t>
+        <w:t xml:space="preserve">='name') }}; </w:t>
+      </w:r>
+      <w:r>
+        <w:rPr>
+          <w:rFonts w:ascii="Arial" w:hAnsi="Arial" w:cs="Arial"/>
+        </w:rPr>
+        <w:t xml:space="preserve">{% if </w:t>
+      </w:r>
+      <w:proofErr w:type="spellStart"/>
+      <w:r>
+        <w:rPr>
+          <w:rFonts w:ascii="Arial" w:hAnsi="Arial" w:cs="Arial"/>
+        </w:rPr>
+        <w:t>case.country</w:t>
+      </w:r>
+      <w:proofErr w:type="spellEnd"/>
+      <w:r>
+        <w:rPr>
+          <w:rFonts w:ascii="Arial" w:hAnsi="Arial" w:cs="Arial"/>
+        </w:rPr>
+        <w:t xml:space="preserve"> == "US" </w:t>
+      </w:r>
+      <w:r>
+        <w:rPr>
+          <w:rFonts w:ascii="Arial" w:hAnsi="Arial" w:cs="Arial"/>
+        </w:rPr>
+        <w:t xml:space="preserve">%}{% if </w:t>
+      </w:r>
+      <w:proofErr w:type="spellStart"/>
+      <w:r>
+        <w:rPr>
+          <w:rFonts w:ascii="Arial" w:hAnsi="Arial" w:cs="Arial"/>
+        </w:rPr>
+        <w:t>case.</w:t>
+      </w:r>
+      <w:r>
+        <w:rPr>
+          <w:rFonts w:ascii="Arial" w:hAnsi="Arial" w:cs="Arial"/>
+        </w:rPr>
+        <w:t>state</w:t>
+      </w:r>
+      <w:proofErr w:type="spellEnd"/>
+      <w:r>
+        <w:rPr>
+          <w:rFonts w:ascii="Arial" w:hAnsi="Arial" w:cs="Arial"/>
+        </w:rPr>
+        <w:t xml:space="preserve"> == "</w:t>
+      </w:r>
+      <w:r>
+        <w:rPr>
+          <w:rFonts w:ascii="Arial" w:hAnsi="Arial" w:cs="Arial"/>
+        </w:rPr>
+        <w:t>MI</w:t>
+      </w:r>
+      <w:r>
+        <w:rPr>
+          <w:rFonts w:ascii="Arial" w:hAnsi="Arial" w:cs="Arial"/>
+        </w:rPr>
+        <w:t xml:space="preserve">" </w:t>
+      </w:r>
+      <w:r>
+        <w:rPr>
+          <w:rFonts w:ascii="Arial" w:hAnsi="Arial" w:cs="Arial"/>
+        </w:rPr>
+        <w:t xml:space="preserve">%}{% if </w:t>
+      </w:r>
+      <w:proofErr w:type="spellStart"/>
+      <w:r>
+        <w:rPr>
+          <w:rFonts w:ascii="Arial" w:hAnsi="Arial" w:cs="Arial"/>
+        </w:rPr>
+        <w:t>case.in_tribal_court</w:t>
+      </w:r>
+      <w:proofErr w:type="spellEnd"/>
+      <w:r>
+        <w:rPr>
+          <w:rFonts w:ascii="Arial" w:hAnsi="Arial" w:cs="Arial"/>
+        </w:rPr>
+        <w:t xml:space="preserve"> </w:t>
+      </w:r>
+      <w:r>
+        <w:rPr>
+          <w:rFonts w:ascii="Arial" w:hAnsi="Arial" w:cs="Arial"/>
+        </w:rPr>
+        <w:t>%}</w:t>
+      </w:r>
+      <w:r>
+        <w:rPr>
+          <w:rFonts w:ascii="Arial" w:hAnsi="Arial" w:cs="Arial"/>
+        </w:rPr>
+        <w:t xml:space="preserve">{{ </w:t>
       </w:r>
       <w:proofErr w:type="spellStart"/>
       <w:r>
@@ -1499,28 +2052,13 @@
         <w:rPr>
           <w:rFonts w:ascii="Arial" w:hAnsi="Arial" w:cs="Arial"/>
         </w:rPr>
-        <w:t xml:space="preserve"> if </w:t>
-      </w:r>
-      <w:proofErr w:type="spellStart"/>
-      <w:r>
-        <w:rPr>
-          <w:rFonts w:ascii="Arial" w:hAnsi="Arial" w:cs="Arial"/>
-        </w:rPr>
-        <w:t>case.state</w:t>
-      </w:r>
-      <w:proofErr w:type="spellEnd"/>
-      <w:r>
-        <w:rPr>
-          <w:rFonts w:ascii="Arial" w:hAnsi="Arial" w:cs="Arial"/>
-        </w:rPr>
-        <w:t xml:space="preserve"> != "MI" else </w:t>
-      </w:r>
-      <w:r>
-        <w:rPr>
-          <w:rFonts w:ascii="Arial" w:hAnsi="Arial" w:cs="Arial"/>
-        </w:rPr>
-        <w:lastRenderedPageBreak/>
-        <w:t>court_list.get_court_info_by_2([</w:t>
+        <w:t xml:space="preserve"> }};{% else %}</w:t>
+      </w:r>
+      <w:r>
+        <w:rPr>
+          <w:rFonts w:ascii="Arial" w:hAnsi="Arial" w:cs="Arial"/>
+        </w:rPr>
+        <w:t>{{ court_list.get_court_info_by_2([</w:t>
       </w:r>
       <w:proofErr w:type="spellStart"/>
       <w:r>
@@ -1674,7 +2212,199 @@
         <w:rPr>
           <w:rFonts w:ascii="Arial" w:hAnsi="Arial" w:cs="Arial"/>
         </w:rPr>
-        <w:t xml:space="preserve">='CSZ') }}; Nature: {{ </w:t>
+        <w:t>='CSZ') }};</w:t>
+      </w:r>
+      <w:r>
+        <w:rPr>
+          <w:rFonts w:ascii="Arial" w:hAnsi="Arial" w:cs="Arial"/>
+        </w:rPr>
+        <w:t xml:space="preserve">{% endif %}{% </w:t>
+      </w:r>
+      <w:proofErr w:type="spellStart"/>
+      <w:r>
+        <w:rPr>
+          <w:rFonts w:ascii="Arial" w:hAnsi="Arial" w:cs="Arial"/>
+        </w:rPr>
+        <w:t>elif</w:t>
+      </w:r>
+      <w:proofErr w:type="spellEnd"/>
+      <w:r>
+        <w:rPr>
+          <w:rFonts w:ascii="Arial" w:hAnsi="Arial" w:cs="Arial"/>
+        </w:rPr>
+        <w:t xml:space="preserve"> </w:t>
+      </w:r>
+      <w:proofErr w:type="spellStart"/>
+      <w:r>
+        <w:rPr>
+          <w:rFonts w:ascii="Arial" w:hAnsi="Arial" w:cs="Arial"/>
+        </w:rPr>
+        <w:t>case.</w:t>
+      </w:r>
+      <w:r>
+        <w:rPr>
+          <w:rFonts w:ascii="Arial" w:hAnsi="Arial" w:cs="Arial"/>
+        </w:rPr>
+        <w:t>state</w:t>
+      </w:r>
+      <w:proofErr w:type="spellEnd"/>
+      <w:r>
+        <w:rPr>
+          <w:rFonts w:ascii="Arial" w:hAnsi="Arial" w:cs="Arial"/>
+        </w:rPr>
+        <w:t xml:space="preserve"> </w:t>
+      </w:r>
+      <w:r>
+        <w:rPr>
+          <w:rFonts w:ascii="Arial" w:hAnsi="Arial" w:cs="Arial"/>
+        </w:rPr>
+        <w:t>!</w:t>
+      </w:r>
+      <w:r>
+        <w:rPr>
+          <w:rFonts w:ascii="Arial" w:hAnsi="Arial" w:cs="Arial"/>
+        </w:rPr>
+        <w:t>= "</w:t>
+      </w:r>
+      <w:r>
+        <w:rPr>
+          <w:rFonts w:ascii="Arial" w:hAnsi="Arial" w:cs="Arial"/>
+        </w:rPr>
+        <w:t>MI</w:t>
+      </w:r>
+      <w:r>
+        <w:rPr>
+          <w:rFonts w:ascii="Arial" w:hAnsi="Arial" w:cs="Arial"/>
+        </w:rPr>
+        <w:t xml:space="preserve">" </w:t>
+      </w:r>
+      <w:r>
+        <w:rPr>
+          <w:rFonts w:ascii="Arial" w:hAnsi="Arial" w:cs="Arial"/>
+        </w:rPr>
+        <w:t xml:space="preserve"> %}{{ </w:t>
+      </w:r>
+      <w:proofErr w:type="spellStart"/>
+      <w:r>
+        <w:rPr>
+          <w:rFonts w:ascii="Arial" w:hAnsi="Arial" w:cs="Arial"/>
+        </w:rPr>
+        <w:t>case.address</w:t>
+      </w:r>
+      <w:proofErr w:type="spellEnd"/>
+      <w:r>
+        <w:rPr>
+          <w:rFonts w:ascii="Arial" w:hAnsi="Arial" w:cs="Arial"/>
+        </w:rPr>
+        <w:t xml:space="preserve"> }};{% endif %}{% </w:t>
+      </w:r>
+      <w:proofErr w:type="spellStart"/>
+      <w:r>
+        <w:rPr>
+          <w:rFonts w:ascii="Arial" w:hAnsi="Arial" w:cs="Arial"/>
+        </w:rPr>
+        <w:t>elif</w:t>
+      </w:r>
+      <w:proofErr w:type="spellEnd"/>
+      <w:r>
+        <w:rPr>
+          <w:rFonts w:ascii="Arial" w:hAnsi="Arial" w:cs="Arial"/>
+        </w:rPr>
+        <w:t xml:space="preserve"> </w:t>
+      </w:r>
+      <w:proofErr w:type="spellStart"/>
+      <w:r>
+        <w:rPr>
+          <w:rFonts w:ascii="Arial" w:hAnsi="Arial" w:cs="Arial"/>
+        </w:rPr>
+        <w:t>case.country</w:t>
+      </w:r>
+      <w:proofErr w:type="spellEnd"/>
+      <w:r>
+        <w:rPr>
+          <w:rFonts w:ascii="Arial" w:hAnsi="Arial" w:cs="Arial"/>
+        </w:rPr>
+        <w:t xml:space="preserve"> </w:t>
+      </w:r>
+      <w:r>
+        <w:rPr>
+          <w:rFonts w:ascii="Arial" w:hAnsi="Arial" w:cs="Arial"/>
+        </w:rPr>
+        <w:t>!</w:t>
+      </w:r>
+      <w:r>
+        <w:rPr>
+          <w:rFonts w:ascii="Arial" w:hAnsi="Arial" w:cs="Arial"/>
+        </w:rPr>
+        <w:t>= "US"</w:t>
+      </w:r>
+      <w:r>
+        <w:rPr>
+          <w:rFonts w:ascii="Arial" w:hAnsi="Arial" w:cs="Arial"/>
+        </w:rPr>
+        <w:t xml:space="preserve"> %}{{ </w:t>
+      </w:r>
+      <w:proofErr w:type="spellStart"/>
+      <w:r>
+        <w:rPr>
+          <w:rFonts w:ascii="Arial" w:hAnsi="Arial" w:cs="Arial"/>
+        </w:rPr>
+        <w:t>case.address</w:t>
+      </w:r>
+      <w:proofErr w:type="spellEnd"/>
+      <w:r>
+        <w:rPr>
+          <w:rFonts w:ascii="Arial" w:hAnsi="Arial" w:cs="Arial"/>
+        </w:rPr>
+        <w:t xml:space="preserve"> }}, {{ </w:t>
+      </w:r>
+      <w:proofErr w:type="spellStart"/>
+      <w:r>
+        <w:rPr>
+          <w:rFonts w:ascii="Arial" w:hAnsi="Arial" w:cs="Arial"/>
+        </w:rPr>
+        <w:t>case.foreign_admin_unit</w:t>
+      </w:r>
+      <w:proofErr w:type="spellEnd"/>
+      <w:r>
+        <w:rPr>
+          <w:rFonts w:ascii="Arial" w:hAnsi="Arial" w:cs="Arial"/>
+        </w:rPr>
+        <w:t xml:space="preserve"> }}, {{ </w:t>
+      </w:r>
+      <w:proofErr w:type="spellStart"/>
+      <w:r>
+        <w:rPr>
+          <w:rFonts w:ascii="Arial" w:hAnsi="Arial" w:cs="Arial"/>
+        </w:rPr>
+        <w:t>country_name</w:t>
+      </w:r>
+      <w:proofErr w:type="spellEnd"/>
+      <w:r>
+        <w:rPr>
+          <w:rFonts w:ascii="Arial" w:hAnsi="Arial" w:cs="Arial"/>
+        </w:rPr>
+        <w:t>(</w:t>
+      </w:r>
+      <w:proofErr w:type="spellStart"/>
+      <w:r>
+        <w:rPr>
+          <w:rFonts w:ascii="Arial" w:hAnsi="Arial" w:cs="Arial"/>
+        </w:rPr>
+        <w:t>case.country</w:t>
+      </w:r>
+      <w:proofErr w:type="spellEnd"/>
+      <w:r>
+        <w:rPr>
+          <w:rFonts w:ascii="Arial" w:hAnsi="Arial" w:cs="Arial"/>
+        </w:rPr>
+        <w:t xml:space="preserve">) }};{% endif %} </w:t>
+      </w:r>
+      <w:r>
+        <w:rPr>
+          <w:rFonts w:ascii="Arial" w:hAnsi="Arial" w:cs="Arial"/>
+        </w:rPr>
+        <w:t xml:space="preserve">Nature: {{ </w:t>
       </w:r>
       <w:proofErr w:type="spellStart"/>
       <w:r>
@@ -1703,6 +2433,12 @@
           <w:rFonts w:ascii="Arial" w:hAnsi="Arial" w:cs="Arial"/>
         </w:rPr>
         <w:t>] }}</w:t>
+      </w:r>
+      <w:r>
+        <w:rPr>
+          <w:rFonts w:ascii="Arial" w:hAnsi="Arial" w:cs="Arial"/>
+        </w:rPr>
+        <w:t>a</w:t>
       </w:r>
       <w:r>
         <w:rPr>
@@ -2007,6 +2743,7 @@
           <w:highlight w:val="yellow"/>
         </w:rPr>
       </w:pPr>
+      <w:proofErr w:type="gramStart"/>
       <w:r>
         <w:rPr>
           <w:rFonts w:ascii="Arial" w:hAnsi="Arial" w:cs="Arial"/>
@@ -2014,6 +2751,7 @@
         </w:rPr>
         <w:t>{%p if</w:t>
       </w:r>
+      <w:proofErr w:type="gramEnd"/>
       <w:r>
         <w:rPr>
           <w:rFonts w:ascii="Arial" w:hAnsi="Arial" w:cs="Arial"/>
@@ -2062,8 +2800,16 @@
         <w:rPr>
           <w:rFonts w:ascii="Arial" w:hAnsi="Arial" w:cs="Arial"/>
         </w:rPr>
-        <w:t>='both') | length &gt; 1 %}</w:t>
-      </w:r>
+        <w:t xml:space="preserve">='both') | length &gt; </w:t>
+      </w:r>
+      <w:proofErr w:type="gramStart"/>
+      <w:r>
+        <w:rPr>
+          <w:rFonts w:ascii="Arial" w:hAnsi="Arial" w:cs="Arial"/>
+        </w:rPr>
+        <w:t>1 %}</w:t>
+      </w:r>
+      <w:proofErr w:type="gramEnd"/>
     </w:p>
     <w:p>
       <w:pPr>
@@ -2140,12 +2886,14 @@
         </w:rPr>
         <w:t>='both'</w:t>
       </w:r>
+      <w:proofErr w:type="gramStart"/>
       <w:r>
         <w:rPr>
           <w:rFonts w:ascii="Arial" w:hAnsi="Arial" w:cs="Arial"/>
         </w:rPr>
         <w:t>) %}</w:t>
       </w:r>
+      <w:proofErr w:type="gramEnd"/>
     </w:p>
     <w:p>
       <w:pPr>
@@ -2535,8 +3283,16 @@
         <w:rPr>
           <w:rFonts w:ascii="Arial" w:hAnsi="Arial" w:cs="Arial"/>
         </w:rPr>
-        <w:t>% endif %}</w:t>
-      </w:r>
+        <w:t xml:space="preserve">% </w:t>
+      </w:r>
+      <w:proofErr w:type="gramStart"/>
+      <w:r>
+        <w:rPr>
+          <w:rFonts w:ascii="Arial" w:hAnsi="Arial" w:cs="Arial"/>
+        </w:rPr>
+        <w:t>endif %}</w:t>
+      </w:r>
+      <w:proofErr w:type="gramEnd"/>
     </w:p>
     <w:p>
       <w:pPr>

</xml_diff>

<commit_message>
fix typo in UCCJEA addendum
</commit_message>
<xml_diff>
--- a/docassemble/MLHDivorceAndCustody/data/templates/UCCJEA_affidavit_mc416_addendum.docx
+++ b/docassemble/MLHDivorceAndCustody/data/templates/UCCJEA_affidavit_mc416_addendum.docx
@@ -695,13 +695,7 @@
         <w:rPr>
           <w:rFonts w:ascii="Arial" w:hAnsi="Arial" w:cs="Arial"/>
         </w:rPr>
-        <w:t xml:space="preserve"> == "US"</w:t>
-      </w:r>
-      <w:r>
-        <w:rPr>
-          <w:rFonts w:ascii="Arial" w:hAnsi="Arial" w:cs="Arial"/>
-        </w:rPr>
-        <w:t xml:space="preserve"> </w:t>
+        <w:t xml:space="preserve"> == "US" </w:t>
       </w:r>
       <w:r>
         <w:rPr>
@@ -2433,12 +2427,6 @@
           <w:rFonts w:ascii="Arial" w:hAnsi="Arial" w:cs="Arial"/>
         </w:rPr>
         <w:t>] }}</w:t>
-      </w:r>
-      <w:r>
-        <w:rPr>
-          <w:rFonts w:ascii="Arial" w:hAnsi="Arial" w:cs="Arial"/>
-        </w:rPr>
-        <w:t>a</w:t>
       </w:r>
       <w:r>
         <w:rPr>

</xml_diff>